<commit_message>
feat: completar experiencia frontend y pruebas e2e
</commit_message>
<xml_diff>
--- a/final/Pruebas End to End SPC.docx
+++ b/final/Pruebas End to End SPC.docx
@@ -35,7 +35,7 @@
         <w:rPr>
           <w:sz w:val="22"/>
         </w:rPr>
-        <w:t>Tipo de Prueba: End to End / Integración de la API</w:t>
+        <w:t>Tipo de Prueba: End to End sobre la aplicación completa (navegador real)</w:t>
       </w:r>
     </w:p>
     <w:p>
@@ -46,7 +46,7 @@
         <w:rPr>
           <w:sz w:val="22"/>
         </w:rPr>
-        <w:t>Marco: pytest + FastAPI TestClient (base SQLite temporal por test)</w:t>
+        <w:t>Herramienta: Selenium WebDriver 4 + Chrome, ejecutado con pytest</w:t>
       </w:r>
     </w:p>
     <w:p>
@@ -57,7 +57,18 @@
         <w:rPr>
           <w:sz w:val="22"/>
         </w:rPr>
-        <w:t>Total de Flujos: 10</w:t>
+        <w:t>Total de Flujos: 11</w:t>
+      </w:r>
+    </w:p>
+    <w:p>
+      <w:pPr>
+        <w:jc w:val="center"/>
+      </w:pPr>
+      <w:r>
+        <w:rPr>
+          <w:sz w:val="22"/>
+        </w:rPr>
+        <w:t>Evidencia: video de la corrida, capturas por paso y logs del servidor</w:t>
       </w:r>
     </w:p>
     <w:p>
@@ -193,7 +204,7 @@
                 <w:color w:val="222222"/>
                 <w:sz w:val="20"/>
               </w:rPr>
-              <w:t>Autenticación y control de acceso por roles</w:t>
+              <w:t>Ingreso al sistema y cierre de sesión</w:t>
             </w:r>
           </w:p>
         </w:tc>
@@ -209,7 +220,7 @@
                 <w:color w:val="222222"/>
                 <w:sz w:val="20"/>
               </w:rPr>
-              <w:t>tests/api/test_auth.py</w:t>
+              <w:t>tests/e2e_selenium/test_01_login.py</w:t>
             </w:r>
           </w:p>
         </w:tc>
@@ -259,7 +270,7 @@
                 <w:color w:val="222222"/>
                 <w:sz w:val="20"/>
               </w:rPr>
-              <w:t>Restablecer contraseña por correo</w:t>
+              <w:t>Solicitud de restablecimiento de contraseña</w:t>
             </w:r>
           </w:p>
         </w:tc>
@@ -275,7 +286,7 @@
                 <w:color w:val="222222"/>
                 <w:sz w:val="20"/>
               </w:rPr>
-              <w:t>tests/api/test_reset_password.py</w:t>
+              <w:t>tests/e2e_selenium/test_02_recuperar_password.py</w:t>
             </w:r>
           </w:p>
         </w:tc>
@@ -325,7 +336,7 @@
                 <w:color w:val="222222"/>
                 <w:sz w:val="20"/>
               </w:rPr>
-              <w:t>Análisis 3×3 por dominio (ventas/compras/almacén)</w:t>
+              <w:t>Ventas: subir el Excel del negocio y obtener los 10 análisis</w:t>
             </w:r>
           </w:p>
         </w:tc>
@@ -341,7 +352,7 @@
                 <w:color w:val="222222"/>
                 <w:sz w:val="20"/>
               </w:rPr>
-              <w:t>tests/api/test_dominios_3x3.py</w:t>
+              <w:t>tests/e2e_selenium/test_03_ventas.py</w:t>
             </w:r>
           </w:p>
         </w:tc>
@@ -391,7 +402,7 @@
                 <w:color w:val="222222"/>
                 <w:sz w:val="20"/>
               </w:rPr>
-              <w:t>Reentrenar → predecir con modelo guardado → elegir versión</w:t>
+              <w:t>Compras: análisis de abastecimiento desde el Excel</w:t>
             </w:r>
           </w:p>
         </w:tc>
@@ -407,7 +418,7 @@
                 <w:color w:val="222222"/>
                 <w:sz w:val="20"/>
               </w:rPr>
-              <w:t>tests/api/test_dominios_3x3.py</w:t>
+              <w:t>tests/e2e_selenium/test_04_compras.py</w:t>
             </w:r>
           </w:p>
         </w:tc>
@@ -457,7 +468,7 @@
                 <w:color w:val="222222"/>
                 <w:sz w:val="20"/>
               </w:rPr>
-              <w:t>Onboarding de datos: esquema, plantilla y carga por Excel (v2)</w:t>
+              <w:t>Almacén: reposición y clasificación ABC desde el Excel</w:t>
             </w:r>
           </w:p>
         </w:tc>
@@ -473,7 +484,7 @@
                 <w:color w:val="222222"/>
                 <w:sz w:val="20"/>
               </w:rPr>
-              <w:t>tests/api/test_dominios_3x3.py</w:t>
+              <w:t>tests/e2e_selenium/test_05_almacen.py</w:t>
             </w:r>
           </w:p>
         </w:tc>
@@ -523,7 +534,7 @@
                 <w:color w:val="222222"/>
                 <w:sz w:val="20"/>
               </w:rPr>
-              <w:t>Catálogo v3: ejecutar 10 consultas por módulo (JSON)</w:t>
+              <w:t>Historial: los análisis quedan guardados y se pueden reabrir</w:t>
             </w:r>
           </w:p>
         </w:tc>
@@ -539,7 +550,7 @@
                 <w:color w:val="222222"/>
                 <w:sz w:val="20"/>
               </w:rPr>
-              <w:t>tests/api/test_catalogo_v3.py</w:t>
+              <w:t>tests/e2e_selenium/test_06_historial.py</w:t>
             </w:r>
           </w:p>
         </w:tc>
@@ -589,7 +600,7 @@
                 <w:color w:val="222222"/>
                 <w:sz w:val="20"/>
               </w:rPr>
-              <w:t>Catálogo v3: carga por archivo (Excel/JSON) y demo</w:t>
+              <w:t>Administración: crear un rol con permisos y un usuario</w:t>
             </w:r>
           </w:p>
         </w:tc>
@@ -605,7 +616,7 @@
                 <w:color w:val="222222"/>
                 <w:sz w:val="20"/>
               </w:rPr>
-              <w:t>tests/api/test_ingesta_v3_archivo.py</w:t>
+              <w:t>tests/e2e_selenium/test_07_usuarios_roles.py</w:t>
             </w:r>
           </w:p>
         </w:tc>
@@ -655,7 +666,7 @@
                 <w:color w:val="222222"/>
                 <w:sz w:val="20"/>
               </w:rPr>
-              <w:t>Historial de análisis y detalle</w:t>
+              <w:t>Usuario nuevo: onboarding, permisos aplicados y datos aislados</w:t>
             </w:r>
           </w:p>
         </w:tc>
@@ -671,7 +682,7 @@
                 <w:color w:val="222222"/>
                 <w:sz w:val="20"/>
               </w:rPr>
-              <w:t>tests/api/test_historial_v3.py</w:t>
+              <w:t>tests/e2e_selenium/test_08_rbac_usuario_nuevo.py</w:t>
             </w:r>
           </w:p>
         </w:tc>
@@ -721,7 +732,7 @@
                 <w:color w:val="222222"/>
                 <w:sz w:val="20"/>
               </w:rPr>
-              <w:t>Validación de tipos a nivel de API (v3)</w:t>
+              <w:t>Restablecer la contraseña de punta a punta con el enlace</w:t>
             </w:r>
           </w:p>
         </w:tc>
@@ -737,7 +748,7 @@
                 <w:color w:val="222222"/>
                 <w:sz w:val="20"/>
               </w:rPr>
-              <w:t>tests/api/test_validacion_v3_api.py</w:t>
+              <w:t>tests/e2e_selenium/test_09_reset_password_completo.py</w:t>
             </w:r>
           </w:p>
         </w:tc>
@@ -787,7 +798,7 @@
                 <w:color w:val="222222"/>
                 <w:sz w:val="20"/>
               </w:rPr>
-              <w:t>Perfil de negocio, CORS y forma uniforme de error</w:t>
+              <w:t>Recorrido por todas las secciones y «Acerca del sistema»</w:t>
             </w:r>
           </w:p>
         </w:tc>
@@ -803,7 +814,73 @@
                 <w:color w:val="222222"/>
                 <w:sz w:val="20"/>
               </w:rPr>
-              <w:t>tests/api/test_auth.py (perfil) / test_cors.py / test_errores_api.py</w:t>
+              <w:t>tests/e2e_selenium/test_10_navegacion.py</w:t>
+            </w:r>
+          </w:p>
+        </w:tc>
+        <w:tc>
+          <w:tcPr>
+            <w:tcW w:type="dxa" w:w="2160"/>
+          </w:tcPr>
+          <w:p>
+            <w:r/>
+            <w:r>
+              <w:rPr>
+                <w:b w:val="0"/>
+                <w:color w:val="222222"/>
+                <w:sz w:val="20"/>
+              </w:rPr>
+              <w:t>PASA</w:t>
+            </w:r>
+          </w:p>
+        </w:tc>
+      </w:tr>
+      <w:tr>
+        <w:tc>
+          <w:tcPr>
+            <w:tcW w:type="dxa" w:w="2160"/>
+          </w:tcPr>
+          <w:p>
+            <w:r/>
+            <w:r>
+              <w:rPr>
+                <w:b w:val="0"/>
+                <w:color w:val="222222"/>
+                <w:sz w:val="20"/>
+              </w:rPr>
+              <w:t>11</w:t>
+            </w:r>
+          </w:p>
+        </w:tc>
+        <w:tc>
+          <w:tcPr>
+            <w:tcW w:type="dxa" w:w="2160"/>
+          </w:tcPr>
+          <w:p>
+            <w:r/>
+            <w:r>
+              <w:rPr>
+                <w:b w:val="0"/>
+                <w:color w:val="222222"/>
+                <w:sz w:val="20"/>
+              </w:rPr>
+              <w:t>Errores de carga explicados, sin caídas</w:t>
+            </w:r>
+          </w:p>
+        </w:tc>
+        <w:tc>
+          <w:tcPr>
+            <w:tcW w:type="dxa" w:w="2160"/>
+          </w:tcPr>
+          <w:p>
+            <w:r/>
+            <w:r>
+              <w:rPr>
+                <w:b w:val="0"/>
+                <w:color w:val="222222"/>
+                <w:sz w:val="20"/>
+              </w:rPr>
+              <w:t>tests/e2e_selenium/test_11_errores_carga.py</w:t>
             </w:r>
           </w:p>
         </w:tc>
@@ -856,7 +933,7 @@
                 <w:color w:val="FFFFFF"/>
                 <w:sz w:val="22"/>
               </w:rPr>
-              <w:t>Flujo 1 — Autenticación y control de acceso por roles</w:t>
+              <w:t>Flujo 1 — Ingreso al sistema y cierre de sesión</w:t>
             </w:r>
           </w:p>
         </w:tc>
@@ -891,7 +968,7 @@
                 <w:color w:val="222222"/>
                 <w:sz w:val="20"/>
               </w:rPr>
-              <w:t>tests/api/test_auth.py</w:t>
+              <w:t>tests/e2e_selenium/test_01_login.py</w:t>
             </w:r>
           </w:p>
         </w:tc>
@@ -910,7 +987,7 @@
                 <w:color w:val="222222"/>
                 <w:sz w:val="20"/>
               </w:rPr>
-              <w:t>Endpoints recorridos</w:t>
+              <w:t>Pantallas recorridas</w:t>
             </w:r>
           </w:p>
         </w:tc>
@@ -926,7 +1003,7 @@
                 <w:color w:val="222222"/>
                 <w:sz w:val="20"/>
               </w:rPr>
-              <w:t>POST /auth/login, GET /auth/me, GET /permissions, POST/PATCH/DELETE /roles, POST/PATCH /users</w:t>
+              <w:t>Login → Panel principal → Login</w:t>
             </w:r>
           </w:p>
         </w:tc>
@@ -961,7 +1038,7 @@
                 <w:color w:val="222222"/>
                 <w:sz w:val="20"/>
               </w:rPr>
-              <w:t>Auth activado (SPC_AUTH_ENABLED=1) con base temporal sembrada (admins 256317/256370).</w:t>
+              <w:t>Aplicación abierta en el navegador; cuentas de demostración sembradas.</w:t>
             </w:r>
           </w:p>
         </w:tc>
@@ -1016,7 +1093,7 @@
                 <w:color w:val="222222"/>
                 <w:sz w:val="20"/>
               </w:rPr>
-              <w:t>1. Login con credenciales válidas → token firmado.</w:t>
+              <w:t>1. Abrir la aplicación: se muestra la pantalla de ingreso.</w:t>
               <w:br/>
             </w:r>
             <w:r>
@@ -1025,7 +1102,7 @@
                 <w:color w:val="222222"/>
                 <w:sz w:val="20"/>
               </w:rPr>
-              <w:t>2. Acceso a endpoint protegido sin token → 401.</w:t>
+              <w:t>2. Ingresar con contraseña incorrecta.</w:t>
               <w:br/>
             </w:r>
             <w:r>
@@ -1034,7 +1111,7 @@
                 <w:color w:val="222222"/>
                 <w:sz w:val="20"/>
               </w:rPr>
-              <w:t>3. Acceso con rol sin permiso → 403.</w:t>
+              <w:t>3. Ingresar con las credenciales del administrador (256370).</w:t>
               <w:br/>
             </w:r>
             <w:r>
@@ -1043,7 +1120,7 @@
                 <w:color w:val="222222"/>
                 <w:sz w:val="20"/>
               </w:rPr>
-              <w:t>4. Alta de rol/usuario por administrador; edición y desactivación.</w:t>
+              <w:t>4. Verificar a qué servidor apunta el panel y cerrar sesión.</w:t>
             </w:r>
           </w:p>
         </w:tc>
@@ -1082,7 +1159,7 @@
                 <w:color w:val="222222"/>
                 <w:sz w:val="20"/>
               </w:rPr>
-              <w:t>Aserciones</w:t>
+              <w:t>Comprobaciones</w:t>
             </w:r>
           </w:p>
         </w:tc>
@@ -1098,7 +1175,7 @@
                 <w:color w:val="222222"/>
                 <w:sz w:val="20"/>
               </w:rPr>
-              <w:t>Token válido abre /auth/me; 401 sin token; 403 sin permiso; el rol admin está protegido.</w:t>
+              <w:t>El intento fallido muestra un mensaje genérico y no deja pasar; el ingreso correcto abre el panel con el usuario en la barra lateral; el cierre de sesión vuelve al login; el log del backend registra POST /auth/login.</w:t>
             </w:r>
           </w:p>
         </w:tc>
@@ -1189,7 +1266,7 @@
                 <w:color w:val="222222"/>
                 <w:sz w:val="20"/>
               </w:rPr>
-              <w:t>FastAPI (crear_app) sobre TestClient de Starlette; base SQLite temporal por test (aislada, no toca la base real ni models/); datos del generador sintético del sistema (spc.synthetic); Supabase Storage deshabilitado (artefactos a disco temporal).</w:t>
+              <w:t>Selenium WebDriver 4 sobre Google Chrome real (ventana visible, resolución 1600×1000). La propia suite levanta el backend (uvicorn, spc.api.main:app) y el frontend (Vite) en puertos libres; el control de acceso está activo y la persistencia usa una base SQLite temporal por corrida (no toca la base real ni Supabase). Datos: los Excel del negocio de ejemplo examples/datos_excel_pyme/botica_farmasalud/.</w:t>
             </w:r>
           </w:p>
         </w:tc>
@@ -1224,7 +1301,7 @@
                 <w:color w:val="222222"/>
                 <w:sz w:val="20"/>
               </w:rPr>
-              <w:t>venv/Scripts/python -m pytest tests/api/ -v</w:t>
+              <w:t>venv/Scripts/python -m pytest tests/e2e_selenium -m selenium -v</w:t>
             </w:r>
           </w:p>
         </w:tc>
@@ -1259,12 +1336,57 @@
                 <w:color w:val="222222"/>
                 <w:sz w:val="20"/>
               </w:rPr>
-              <w:t>Ver final/evidencias/pruebas/e2e/</w:t>
+              <w:t>final/evidencias/pruebas/e2e_selenium/ (video, capturas y logs)</w:t>
             </w:r>
           </w:p>
         </w:tc>
       </w:tr>
     </w:tbl>
+    <w:p/>
+    <w:p>
+      <w:r>
+        <w:drawing>
+          <wp:inline xmlns:a="http://schemas.openxmlformats.org/drawingml/2006/main" xmlns:pic="http://schemas.openxmlformats.org/drawingml/2006/picture">
+            <wp:extent cx="5486400" cy="2700338"/>
+            <wp:docPr id="1" name="Picture 1"/>
+            <wp:cNvGraphicFramePr>
+              <a:graphicFrameLocks noChangeAspect="1"/>
+            </wp:cNvGraphicFramePr>
+            <a:graphic>
+              <a:graphicData uri="http://schemas.openxmlformats.org/drawingml/2006/picture">
+                <pic:pic>
+                  <pic:nvPicPr>
+                    <pic:cNvPr id="0" name="003_ingreso_correcto_como_administrador_256370_se_muestra_el_pan.png"/>
+                    <pic:cNvPicPr/>
+                  </pic:nvPicPr>
+                  <pic:blipFill>
+                    <a:blip r:embed="rId9"/>
+                    <a:stretch>
+                      <a:fillRect/>
+                    </a:stretch>
+                  </pic:blipFill>
+                  <pic:spPr>
+                    <a:xfrm>
+                      <a:off x="0" y="0"/>
+                      <a:ext cx="5486400" cy="2700338"/>
+                    </a:xfrm>
+                    <a:prstGeom prst="rect"/>
+                  </pic:spPr>
+                </pic:pic>
+              </a:graphicData>
+            </a:graphic>
+          </wp:inline>
+        </w:drawing>
+      </w:r>
+    </w:p>
+    <w:p>
+      <w:r>
+        <w:rPr>
+          <w:i/>
+        </w:rPr>
+        <w:t>Figura 1. Ingreso al sistema y cierre de sesión (captura de la corrida).</w:t>
+      </w:r>
+    </w:p>
     <w:p/>
     <w:p>
       <w:r>
@@ -1297,7 +1419,7 @@
                 <w:color w:val="FFFFFF"/>
                 <w:sz w:val="22"/>
               </w:rPr>
-              <w:t>Flujo 2 — Restablecer contraseña por correo</w:t>
+              <w:t>Flujo 2 — Solicitud de restablecimiento de contraseña</w:t>
             </w:r>
           </w:p>
         </w:tc>
@@ -1332,7 +1454,7 @@
                 <w:color w:val="222222"/>
                 <w:sz w:val="20"/>
               </w:rPr>
-              <w:t>tests/api/test_reset_password.py</w:t>
+              <w:t>tests/e2e_selenium/test_02_recuperar_password.py</w:t>
             </w:r>
           </w:p>
         </w:tc>
@@ -1351,7 +1473,7 @@
                 <w:color w:val="222222"/>
                 <w:sz w:val="20"/>
               </w:rPr>
-              <w:t>Endpoints recorridos</w:t>
+              <w:t>Pantallas recorridas</w:t>
             </w:r>
           </w:p>
         </w:tc>
@@ -1367,7 +1489,7 @@
                 <w:color w:val="222222"/>
                 <w:sz w:val="20"/>
               </w:rPr>
-              <w:t>POST /auth/forgot, POST /auth/reset</w:t>
+              <w:t>Login → ¿Olvidaste tu contraseña?</w:t>
             </w:r>
           </w:p>
         </w:tc>
@@ -1402,7 +1524,7 @@
                 <w:color w:val="222222"/>
                 <w:sz w:val="20"/>
               </w:rPr>
-              <w:t>Cuenta con correo; SMTP en modo desarrollo (enlace al log).</w:t>
+              <w:t>Sin sesión iniciada.</w:t>
             </w:r>
           </w:p>
         </w:tc>
@@ -1457,7 +1579,7 @@
                 <w:color w:val="222222"/>
                 <w:sz w:val="20"/>
               </w:rPr>
-              <w:t>1. Solicitar enlace con correo válido → respuesta genérica.</w:t>
+              <w:t>1. Abrir «¿Olvidaste tu contraseña?».</w:t>
               <w:br/>
             </w:r>
             <w:r>
@@ -1466,7 +1588,7 @@
                 <w:color w:val="222222"/>
                 <w:sz w:val="20"/>
               </w:rPr>
-              <w:t>2. Solicitar con correo inexistente → misma respuesta (no revela existencia).</w:t>
+              <w:t>2. Enviar un correo que no existe en el sistema.</w:t>
               <w:br/>
             </w:r>
             <w:r>
@@ -1475,7 +1597,7 @@
                 <w:color w:val="222222"/>
                 <w:sz w:val="20"/>
               </w:rPr>
-              <w:t>3. Fijar nueva contraseña con token válido; reutilizar el token → 400.</w:t>
+              <w:t>3. Leer la respuesta y volver al login.</w:t>
             </w:r>
           </w:p>
         </w:tc>
@@ -1514,7 +1636,7 @@
                 <w:color w:val="222222"/>
                 <w:sz w:val="20"/>
               </w:rPr>
-              <w:t>Aserciones</w:t>
+              <w:t>Comprobaciones</w:t>
             </w:r>
           </w:p>
         </w:tc>
@@ -1530,7 +1652,7 @@
                 <w:color w:val="222222"/>
                 <w:sz w:val="20"/>
               </w:rPr>
-              <w:t>Respuesta genérica siempre; token de un solo uso; contraseña nueva funciona.</w:t>
+              <w:t>La respuesta es genérica («si la cuenta existe…»): no revela si el correo está registrado; el backend registra la solicitud (POST /auth/forgot).</w:t>
             </w:r>
           </w:p>
         </w:tc>
@@ -1621,7 +1743,7 @@
                 <w:color w:val="222222"/>
                 <w:sz w:val="20"/>
               </w:rPr>
-              <w:t>FastAPI (crear_app) sobre TestClient de Starlette; base SQLite temporal por test (aislada, no toca la base real ni models/); datos del generador sintético del sistema (spc.synthetic); Supabase Storage deshabilitado (artefactos a disco temporal).</w:t>
+              <w:t>Selenium WebDriver 4 sobre Google Chrome real (ventana visible, resolución 1600×1000). La propia suite levanta el backend (uvicorn, spc.api.main:app) y el frontend (Vite) en puertos libres; el control de acceso está activo y la persistencia usa una base SQLite temporal por corrida (no toca la base real ni Supabase). Datos: los Excel del negocio de ejemplo examples/datos_excel_pyme/botica_farmasalud/.</w:t>
             </w:r>
           </w:p>
         </w:tc>
@@ -1656,7 +1778,7 @@
                 <w:color w:val="222222"/>
                 <w:sz w:val="20"/>
               </w:rPr>
-              <w:t>venv/Scripts/python -m pytest tests/api/ -v</w:t>
+              <w:t>venv/Scripts/python -m pytest tests/e2e_selenium -m selenium -v</w:t>
             </w:r>
           </w:p>
         </w:tc>
@@ -1691,12 +1813,57 @@
                 <w:color w:val="222222"/>
                 <w:sz w:val="20"/>
               </w:rPr>
-              <w:t>Ver final/evidencias/pruebas/e2e/</w:t>
+              <w:t>final/evidencias/pruebas/e2e_selenium/ (video, capturas y logs)</w:t>
             </w:r>
           </w:p>
         </w:tc>
       </w:tr>
     </w:tbl>
+    <w:p/>
+    <w:p>
+      <w:r>
+        <w:drawing>
+          <wp:inline xmlns:a="http://schemas.openxmlformats.org/drawingml/2006/main" xmlns:pic="http://schemas.openxmlformats.org/drawingml/2006/picture">
+            <wp:extent cx="5486400" cy="2700338"/>
+            <wp:docPr id="2" name="Picture 2"/>
+            <wp:cNvGraphicFramePr>
+              <a:graphicFrameLocks noChangeAspect="1"/>
+            </wp:cNvGraphicFramePr>
+            <a:graphic>
+              <a:graphicData uri="http://schemas.openxmlformats.org/drawingml/2006/picture">
+                <pic:pic>
+                  <pic:nvPicPr>
+                    <pic:cNvPr id="0" name="007_correo_inexistente_respuesta_gen_rica_si_la_cuenta_existe_te.png"/>
+                    <pic:cNvPicPr/>
+                  </pic:nvPicPr>
+                  <pic:blipFill>
+                    <a:blip r:embed="rId10"/>
+                    <a:stretch>
+                      <a:fillRect/>
+                    </a:stretch>
+                  </pic:blipFill>
+                  <pic:spPr>
+                    <a:xfrm>
+                      <a:off x="0" y="0"/>
+                      <a:ext cx="5486400" cy="2700338"/>
+                    </a:xfrm>
+                    <a:prstGeom prst="rect"/>
+                  </pic:spPr>
+                </pic:pic>
+              </a:graphicData>
+            </a:graphic>
+          </wp:inline>
+        </w:drawing>
+      </w:r>
+    </w:p>
+    <w:p>
+      <w:r>
+        <w:rPr>
+          <w:i/>
+        </w:rPr>
+        <w:t>Figura 2. Solicitud de restablecimiento de contraseña (captura de la corrida).</w:t>
+      </w:r>
+    </w:p>
     <w:p/>
     <w:p>
       <w:r>
@@ -1729,7 +1896,7 @@
                 <w:color w:val="FFFFFF"/>
                 <w:sz w:val="22"/>
               </w:rPr>
-              <w:t>Flujo 3 — Análisis 3×3 por dominio (ventas/compras/almacén)</w:t>
+              <w:t>Flujo 3 — Ventas: subir el Excel del negocio y obtener los 10 análisis</w:t>
             </w:r>
           </w:p>
         </w:tc>
@@ -1764,7 +1931,7 @@
                 <w:color w:val="222222"/>
                 <w:sz w:val="20"/>
               </w:rPr>
-              <w:t>tests/api/test_dominios_3x3.py</w:t>
+              <w:t>tests/e2e_selenium/test_03_ventas.py</w:t>
             </w:r>
           </w:p>
         </w:tc>
@@ -1783,7 +1950,7 @@
                 <w:color w:val="222222"/>
                 <w:sz w:val="20"/>
               </w:rPr>
-              <w:t>Endpoints recorridos</w:t>
+              <w:t>Pantallas recorridas</w:t>
             </w:r>
           </w:p>
         </w:tc>
@@ -1799,7 +1966,7 @@
                 <w:color w:val="222222"/>
                 <w:sz w:val="20"/>
               </w:rPr>
-              <w:t>POST /v2/{dominio}, GET /v2/{dominio}/demo</w:t>
+              <w:t>Panel → Ventas (3 pasos guiados)</w:t>
             </w:r>
           </w:p>
         </w:tc>
@@ -1834,7 +2001,7 @@
                 <w:color w:val="222222"/>
                 <w:sz w:val="20"/>
               </w:rPr>
-              <w:t>Dataset del dominio con historia suficiente (generador sintético).</w:t>
+              <w:t>Sesión de administrador; archivo ventas.xlsx del negocio de ejemplo.</w:t>
             </w:r>
           </w:p>
         </w:tc>
@@ -1889,7 +2056,7 @@
                 <w:color w:val="222222"/>
                 <w:sz w:val="20"/>
               </w:rPr>
-              <w:t>1. Enviar rows del dominio con horizonte.</w:t>
+              <w:t>1. Entrar al módulo Ventas.</w:t>
               <w:br/>
             </w:r>
             <w:r>
@@ -1898,7 +2065,7 @@
                 <w:color w:val="222222"/>
                 <w:sz w:val="20"/>
               </w:rPr>
-              <w:t>2. Recibir los tres bloques: regresión, clasificación, clustering.</w:t>
+              <w:t>2. Subir ventas.xlsx en el Paso 3 (el navegador adjunta el archivo real).</w:t>
               <w:br/>
             </w:r>
             <w:r>
@@ -1907,7 +2074,16 @@
                 <w:color w:val="222222"/>
                 <w:sz w:val="20"/>
               </w:rPr>
-              <w:t>3. Ejecutar la demo integrada.</w:t>
+              <w:t>3. Esperar a que el sistema entrene y devuelva los resultados.</w:t>
+              <w:br/>
+            </w:r>
+            <w:r>
+              <w:rPr>
+                <w:b w:val="0"/>
+                <w:color w:val="222222"/>
+                <w:sz w:val="20"/>
+              </w:rPr>
+              <w:t>4. Abrir el detalle técnico de un reporte.</w:t>
             </w:r>
           </w:p>
         </w:tc>
@@ -1946,7 +2122,7 @@
                 <w:color w:val="222222"/>
                 <w:sz w:val="20"/>
               </w:rPr>
-              <w:t>Aserciones</w:t>
+              <w:t>Comprobaciones</w:t>
             </w:r>
           </w:p>
         </w:tc>
@@ -1962,7 +2138,7 @@
                 <w:color w:val="222222"/>
                 <w:sz w:val="20"/>
               </w:rPr>
-              <w:t>Los tres modelos presentes; regresión con modelo_ganador; clustering k≥2; alertas por serie.</w:t>
+              <w:t>Llegan 10 reportes con los tres tipos (predicción, alerta y segmento); la carga informa las columnas reconocidas; el detalle técnico muestra modelo y métrica; el backend registra POST /v3/ventas/archivo.</w:t>
             </w:r>
           </w:p>
         </w:tc>
@@ -2053,7 +2229,7 @@
                 <w:color w:val="222222"/>
                 <w:sz w:val="20"/>
               </w:rPr>
-              <w:t>FastAPI (crear_app) sobre TestClient de Starlette; base SQLite temporal por test (aislada, no toca la base real ni models/); datos del generador sintético del sistema (spc.synthetic); Supabase Storage deshabilitado (artefactos a disco temporal).</w:t>
+              <w:t>Selenium WebDriver 4 sobre Google Chrome real (ventana visible, resolución 1600×1000). La propia suite levanta el backend (uvicorn, spc.api.main:app) y el frontend (Vite) en puertos libres; el control de acceso está activo y la persistencia usa una base SQLite temporal por corrida (no toca la base real ni Supabase). Datos: los Excel del negocio de ejemplo examples/datos_excel_pyme/botica_farmasalud/.</w:t>
             </w:r>
           </w:p>
         </w:tc>
@@ -2088,7 +2264,7 @@
                 <w:color w:val="222222"/>
                 <w:sz w:val="20"/>
               </w:rPr>
-              <w:t>venv/Scripts/python -m pytest tests/api/ -v</w:t>
+              <w:t>venv/Scripts/python -m pytest tests/e2e_selenium -m selenium -v</w:t>
             </w:r>
           </w:p>
         </w:tc>
@@ -2123,12 +2299,57 @@
                 <w:color w:val="222222"/>
                 <w:sz w:val="20"/>
               </w:rPr>
-              <w:t>Ver final/evidencias/pruebas/e2e/</w:t>
+              <w:t>final/evidencias/pruebas/e2e_selenium/ (video, capturas y logs)</w:t>
             </w:r>
           </w:p>
         </w:tc>
       </w:tr>
     </w:tbl>
+    <w:p/>
+    <w:p>
+      <w:r>
+        <w:drawing>
+          <wp:inline xmlns:a="http://schemas.openxmlformats.org/drawingml/2006/main" xmlns:pic="http://schemas.openxmlformats.org/drawingml/2006/picture">
+            <wp:extent cx="5486400" cy="2700338"/>
+            <wp:docPr id="3" name="Picture 3"/>
+            <wp:cNvGraphicFramePr>
+              <a:graphicFrameLocks noChangeAspect="1"/>
+            </wp:cNvGraphicFramePr>
+            <a:graphic>
+              <a:graphicData uri="http://schemas.openxmlformats.org/drawingml/2006/picture">
+                <pic:pic>
+                  <pic:nvPicPr>
+                    <pic:cNvPr id="0" name="011_se_sube_ventas_xlsx_y_el_sistema_entrena_y_devuelve_10_an_li.png"/>
+                    <pic:cNvPicPr/>
+                  </pic:nvPicPr>
+                  <pic:blipFill>
+                    <a:blip r:embed="rId11"/>
+                    <a:stretch>
+                      <a:fillRect/>
+                    </a:stretch>
+                  </pic:blipFill>
+                  <pic:spPr>
+                    <a:xfrm>
+                      <a:off x="0" y="0"/>
+                      <a:ext cx="5486400" cy="2700338"/>
+                    </a:xfrm>
+                    <a:prstGeom prst="rect"/>
+                  </pic:spPr>
+                </pic:pic>
+              </a:graphicData>
+            </a:graphic>
+          </wp:inline>
+        </w:drawing>
+      </w:r>
+    </w:p>
+    <w:p>
+      <w:r>
+        <w:rPr>
+          <w:i/>
+        </w:rPr>
+        <w:t>Figura 3. Ventas: subir el Excel del negocio y obtener los 10 análisis (captura de la corrida).</w:t>
+      </w:r>
+    </w:p>
     <w:p/>
     <w:p>
       <w:r>
@@ -2161,7 +2382,7 @@
                 <w:color w:val="FFFFFF"/>
                 <w:sz w:val="22"/>
               </w:rPr>
-              <w:t>Flujo 4 — Reentrenar → predecir con modelo guardado → elegir versión</w:t>
+              <w:t>Flujo 4 — Compras: análisis de abastecimiento desde el Excel</w:t>
             </w:r>
           </w:p>
         </w:tc>
@@ -2196,7 +2417,7 @@
                 <w:color w:val="222222"/>
                 <w:sz w:val="20"/>
               </w:rPr>
-              <w:t>tests/api/test_dominios_3x3.py</w:t>
+              <w:t>tests/e2e_selenium/test_04_compras.py</w:t>
             </w:r>
           </w:p>
         </w:tc>
@@ -2215,7 +2436,7 @@
                 <w:color w:val="222222"/>
                 <w:sz w:val="20"/>
               </w:rPr>
-              <w:t>Endpoints recorridos</w:t>
+              <w:t>Pantallas recorridas</w:t>
             </w:r>
           </w:p>
         </w:tc>
@@ -2231,7 +2452,7 @@
                 <w:color w:val="222222"/>
                 <w:sz w:val="20"/>
               </w:rPr>
-              <w:t>POST /v2/{dominio}/entrenar, POST /v2/{dominio}/predecir, GET /v2/{dominio}/modelos, POST /v2/{dominio}/modelos/{id}/servir</w:t>
+              <w:t>Panel → Compras</w:t>
             </w:r>
           </w:p>
         </w:tc>
@@ -2266,7 +2487,7 @@
                 <w:color w:val="222222"/>
                 <w:sz w:val="20"/>
               </w:rPr>
-              <w:t>Corpus acumulado (idempotente) de dos lotes con fechas distintas.</w:t>
+              <w:t>Sesión de administrador; archivo compras.xlsx.</w:t>
             </w:r>
           </w:p>
         </w:tc>
@@ -2321,7 +2542,7 @@
                 <w:color w:val="222222"/>
                 <w:sz w:val="20"/>
               </w:rPr>
-              <w:t>1. Acumular corpus en dos lotes + un reenvío duplicado.</w:t>
+              <w:t>1. Entrar al módulo Compras.</w:t>
               <w:br/>
             </w:r>
             <w:r>
@@ -2330,7 +2551,7 @@
                 <w:color w:val="222222"/>
                 <w:sz w:val="20"/>
               </w:rPr>
-              <w:t>2. Entrenar (v1): versiona regresión y clasificación; corpus_filas = total sin duplicar.</w:t>
+              <w:t>2. Subir compras.xlsx.</w:t>
               <w:br/>
             </w:r>
             <w:r>
@@ -2339,16 +2560,7 @@
                 <w:color w:val="222222"/>
                 <w:sz w:val="20"/>
               </w:rPr>
-              <w:t>3. Predecir: sirve el modelo adoptado (sin reentrenar) y reporta su versión.</w:t>
-              <w:br/>
-            </w:r>
-            <w:r>
-              <w:rPr>
-                <w:b w:val="0"/>
-                <w:color w:val="222222"/>
-                <w:sz w:val="20"/>
-              </w:rPr>
-              <w:t>4. Entrenar otra vez (v2) y elegir explícitamente servir la v1.</w:t>
+              <w:t>3. Revisar las preguntas que responde cada tarjeta.</w:t>
             </w:r>
           </w:p>
         </w:tc>
@@ -2387,7 +2599,7 @@
                 <w:color w:val="222222"/>
                 <w:sz w:val="20"/>
               </w:rPr>
-              <w:t>Aserciones</w:t>
+              <w:t>Comprobaciones</w:t>
             </w:r>
           </w:p>
         </w:tc>
@@ -2403,7 +2615,7 @@
                 <w:color w:val="222222"/>
                 <w:sz w:val="20"/>
               </w:rPr>
-              <w:t>servido_desde='modelo_guardado'; solo una versión is_serving por tarea; /predecir respeta la versión elegida; auditoría en tabla predictions.</w:t>
+              <w:t>Se generan los 10 análisis del módulo (cantidad a pedir, tiempo de entrega, costo y cumplimiento del proveedor) y cada tarjeta indica la pregunta que responde.</w:t>
             </w:r>
           </w:p>
         </w:tc>
@@ -2494,7 +2706,7 @@
                 <w:color w:val="222222"/>
                 <w:sz w:val="20"/>
               </w:rPr>
-              <w:t>FastAPI (crear_app) sobre TestClient de Starlette; base SQLite temporal por test (aislada, no toca la base real ni models/); datos del generador sintético del sistema (spc.synthetic); Supabase Storage deshabilitado (artefactos a disco temporal).</w:t>
+              <w:t>Selenium WebDriver 4 sobre Google Chrome real (ventana visible, resolución 1600×1000). La propia suite levanta el backend (uvicorn, spc.api.main:app) y el frontend (Vite) en puertos libres; el control de acceso está activo y la persistencia usa una base SQLite temporal por corrida (no toca la base real ni Supabase). Datos: los Excel del negocio de ejemplo examples/datos_excel_pyme/botica_farmasalud/.</w:t>
             </w:r>
           </w:p>
         </w:tc>
@@ -2529,7 +2741,7 @@
                 <w:color w:val="222222"/>
                 <w:sz w:val="20"/>
               </w:rPr>
-              <w:t>venv/Scripts/python -m pytest tests/api/ -v</w:t>
+              <w:t>venv/Scripts/python -m pytest tests/e2e_selenium -m selenium -v</w:t>
             </w:r>
           </w:p>
         </w:tc>
@@ -2564,12 +2776,57 @@
                 <w:color w:val="222222"/>
                 <w:sz w:val="20"/>
               </w:rPr>
-              <w:t>Ver final/evidencias/pruebas/e2e/</w:t>
+              <w:t>final/evidencias/pruebas/e2e_selenium/ (video, capturas y logs)</w:t>
             </w:r>
           </w:p>
         </w:tc>
       </w:tr>
     </w:tbl>
+    <w:p/>
+    <w:p>
+      <w:r>
+        <w:drawing>
+          <wp:inline xmlns:a="http://schemas.openxmlformats.org/drawingml/2006/main" xmlns:pic="http://schemas.openxmlformats.org/drawingml/2006/picture">
+            <wp:extent cx="5486400" cy="2700338"/>
+            <wp:docPr id="4" name="Picture 4"/>
+            <wp:cNvGraphicFramePr>
+              <a:graphicFrameLocks noChangeAspect="1"/>
+            </wp:cNvGraphicFramePr>
+            <a:graphic>
+              <a:graphicData uri="http://schemas.openxmlformats.org/drawingml/2006/picture">
+                <pic:pic>
+                  <pic:nvPicPr>
+                    <pic:cNvPr id="0" name="016_se_sube_compras_xlsx_y_llegan_10_an_lisis_de_compras.png"/>
+                    <pic:cNvPicPr/>
+                  </pic:nvPicPr>
+                  <pic:blipFill>
+                    <a:blip r:embed="rId12"/>
+                    <a:stretch>
+                      <a:fillRect/>
+                    </a:stretch>
+                  </pic:blipFill>
+                  <pic:spPr>
+                    <a:xfrm>
+                      <a:off x="0" y="0"/>
+                      <a:ext cx="5486400" cy="2700338"/>
+                    </a:xfrm>
+                    <a:prstGeom prst="rect"/>
+                  </pic:spPr>
+                </pic:pic>
+              </a:graphicData>
+            </a:graphic>
+          </wp:inline>
+        </w:drawing>
+      </w:r>
+    </w:p>
+    <w:p>
+      <w:r>
+        <w:rPr>
+          <w:i/>
+        </w:rPr>
+        <w:t>Figura 4. Compras: análisis de abastecimiento desde el Excel (captura de la corrida).</w:t>
+      </w:r>
+    </w:p>
     <w:p/>
     <w:p>
       <w:r>
@@ -2602,7 +2859,7 @@
                 <w:color w:val="FFFFFF"/>
                 <w:sz w:val="22"/>
               </w:rPr>
-              <w:t>Flujo 5 — Onboarding de datos: esquema, plantilla y carga por Excel (v2)</w:t>
+              <w:t>Flujo 5 — Almacén: reposición y clasificación ABC desde el Excel</w:t>
             </w:r>
           </w:p>
         </w:tc>
@@ -2637,7 +2894,7 @@
                 <w:color w:val="222222"/>
                 <w:sz w:val="20"/>
               </w:rPr>
-              <w:t>tests/api/test_dominios_3x3.py</w:t>
+              <w:t>tests/e2e_selenium/test_05_almacen.py</w:t>
             </w:r>
           </w:p>
         </w:tc>
@@ -2656,7 +2913,7 @@
                 <w:color w:val="222222"/>
                 <w:sz w:val="20"/>
               </w:rPr>
-              <w:t>Endpoints recorridos</w:t>
+              <w:t>Pantallas recorridas</w:t>
             </w:r>
           </w:p>
         </w:tc>
@@ -2672,7 +2929,7 @@
                 <w:color w:val="222222"/>
                 <w:sz w:val="20"/>
               </w:rPr>
-              <w:t>GET /v2/{dominio}/esquema, GET /v2/{dominio}/plantilla, POST /v2/{dominio}/excel</w:t>
+              <w:t>Panel → Almacén</w:t>
             </w:r>
           </w:p>
         </w:tc>
@@ -2707,7 +2964,7 @@
                 <w:color w:val="222222"/>
                 <w:sz w:val="20"/>
               </w:rPr>
-              <w:t>Ninguna (la plantilla y el esquema son informativos).</w:t>
+              <w:t>Sesión de administrador; archivo almacen.xlsx.</w:t>
             </w:r>
           </w:p>
         </w:tc>
@@ -2762,7 +3019,7 @@
                 <w:color w:val="222222"/>
                 <w:sz w:val="20"/>
               </w:rPr>
-              <w:t>1. Consultar el diccionario de variables del dominio.</w:t>
+              <w:t>1. Entrar al módulo Almacén.</w:t>
               <w:br/>
             </w:r>
             <w:r>
@@ -2771,7 +3028,7 @@
                 <w:color w:val="222222"/>
                 <w:sz w:val="20"/>
               </w:rPr>
-              <w:t>2. Descargar la plantilla (JSON y Excel).</w:t>
+              <w:t>2. Subir almacen.xlsx.</w:t>
               <w:br/>
             </w:r>
             <w:r>
@@ -2780,16 +3037,7 @@
                 <w:color w:val="222222"/>
                 <w:sz w:val="20"/>
               </w:rPr>
-              <w:t>3. Subir un Excel con historia suficiente → corre el análisis.</w:t>
-              <w:br/>
-            </w:r>
-            <w:r>
-              <w:rPr>
-                <w:b w:val="0"/>
-                <w:color w:val="222222"/>
-                <w:sz w:val="20"/>
-              </w:rPr>
-              <w:t>4. Subir un Excel corrupto → error controlado.</w:t>
+              <w:t>3. Comprobar que hay segmentaciones entre los resultados.</w:t>
             </w:r>
           </w:p>
         </w:tc>
@@ -2828,7 +3076,7 @@
                 <w:color w:val="222222"/>
                 <w:sz w:val="20"/>
               </w:rPr>
-              <w:t>Aserciones</w:t>
+              <w:t>Comprobaciones</w:t>
             </w:r>
           </w:p>
         </w:tc>
@@ -2844,7 +3092,7 @@
                 <w:color w:val="222222"/>
                 <w:sz w:val="20"/>
               </w:rPr>
-              <w:t>Esquema con columnas y roles; plantilla Excel es .xlsx (firma PK); Excel válido devuelve los 3 bloques; Excel malo → 400.</w:t>
+              <w:t>Se generan los 10 análisis, incluida al menos una segmentación (clasificación ABC / agrupación de productos); el backend registra POST /v3/almacen/archivo.</w:t>
             </w:r>
           </w:p>
         </w:tc>
@@ -2935,7 +3183,7 @@
                 <w:color w:val="222222"/>
                 <w:sz w:val="20"/>
               </w:rPr>
-              <w:t>FastAPI (crear_app) sobre TestClient de Starlette; base SQLite temporal por test (aislada, no toca la base real ni models/); datos del generador sintético del sistema (spc.synthetic); Supabase Storage deshabilitado (artefactos a disco temporal).</w:t>
+              <w:t>Selenium WebDriver 4 sobre Google Chrome real (ventana visible, resolución 1600×1000). La propia suite levanta el backend (uvicorn, spc.api.main:app) y el frontend (Vite) en puertos libres; el control de acceso está activo y la persistencia usa una base SQLite temporal por corrida (no toca la base real ni Supabase). Datos: los Excel del negocio de ejemplo examples/datos_excel_pyme/botica_farmasalud/.</w:t>
             </w:r>
           </w:p>
         </w:tc>
@@ -2970,7 +3218,7 @@
                 <w:color w:val="222222"/>
                 <w:sz w:val="20"/>
               </w:rPr>
-              <w:t>venv/Scripts/python -m pytest tests/api/ -v</w:t>
+              <w:t>venv/Scripts/python -m pytest tests/e2e_selenium -m selenium -v</w:t>
             </w:r>
           </w:p>
         </w:tc>
@@ -3005,12 +3253,57 @@
                 <w:color w:val="222222"/>
                 <w:sz w:val="20"/>
               </w:rPr>
-              <w:t>Ver final/evidencias/pruebas/e2e/</w:t>
+              <w:t>final/evidencias/pruebas/e2e_selenium/ (video, capturas y logs)</w:t>
             </w:r>
           </w:p>
         </w:tc>
       </w:tr>
     </w:tbl>
+    <w:p/>
+    <w:p>
+      <w:r>
+        <w:drawing>
+          <wp:inline xmlns:a="http://schemas.openxmlformats.org/drawingml/2006/main" xmlns:pic="http://schemas.openxmlformats.org/drawingml/2006/picture">
+            <wp:extent cx="5486400" cy="2700338"/>
+            <wp:docPr id="5" name="Picture 5"/>
+            <wp:cNvGraphicFramePr>
+              <a:graphicFrameLocks noChangeAspect="1"/>
+            </wp:cNvGraphicFramePr>
+            <a:graphic>
+              <a:graphicData uri="http://schemas.openxmlformats.org/drawingml/2006/picture">
+                <pic:pic>
+                  <pic:nvPicPr>
+                    <pic:cNvPr id="0" name="019_se_sube_almacen_xlsx_y_llegan_10_an_lisis_de_almac_n.png"/>
+                    <pic:cNvPicPr/>
+                  </pic:nvPicPr>
+                  <pic:blipFill>
+                    <a:blip r:embed="rId13"/>
+                    <a:stretch>
+                      <a:fillRect/>
+                    </a:stretch>
+                  </pic:blipFill>
+                  <pic:spPr>
+                    <a:xfrm>
+                      <a:off x="0" y="0"/>
+                      <a:ext cx="5486400" cy="2700338"/>
+                    </a:xfrm>
+                    <a:prstGeom prst="rect"/>
+                  </pic:spPr>
+                </pic:pic>
+              </a:graphicData>
+            </a:graphic>
+          </wp:inline>
+        </w:drawing>
+      </w:r>
+    </w:p>
+    <w:p>
+      <w:r>
+        <w:rPr>
+          <w:i/>
+        </w:rPr>
+        <w:t>Figura 5. Almacén: reposición y clasificación ABC desde el Excel (captura de la corrida).</w:t>
+      </w:r>
+    </w:p>
     <w:p/>
     <w:p>
       <w:r>
@@ -3043,7 +3336,7 @@
                 <w:color w:val="FFFFFF"/>
                 <w:sz w:val="22"/>
               </w:rPr>
-              <w:t>Flujo 6 — Catálogo v3: ejecutar 10 consultas por módulo (JSON)</w:t>
+              <w:t>Flujo 6 — Historial: los análisis quedan guardados y se pueden reabrir</w:t>
             </w:r>
           </w:p>
         </w:tc>
@@ -3078,7 +3371,7 @@
                 <w:color w:val="222222"/>
                 <w:sz w:val="20"/>
               </w:rPr>
-              <w:t>tests/api/test_catalogo_v3.py</w:t>
+              <w:t>tests/e2e_selenium/test_06_historial.py</w:t>
             </w:r>
           </w:p>
         </w:tc>
@@ -3097,7 +3390,7 @@
                 <w:color w:val="222222"/>
                 <w:sz w:val="20"/>
               </w:rPr>
-              <w:t>Endpoints recorridos</w:t>
+              <w:t>Pantallas recorridas</w:t>
             </w:r>
           </w:p>
         </w:tc>
@@ -3113,7 +3406,7 @@
                 <w:color w:val="222222"/>
                 <w:sz w:val="20"/>
               </w:rPr>
-              <w:t>GET /v3/catalogo, POST /v3/{modulo}, GET /v3/{modulo}/plantilla</w:t>
+              <w:t>Ventas → Paso 4 (Historial de análisis)</w:t>
             </w:r>
           </w:p>
         </w:tc>
@@ -3148,7 +3441,7 @@
                 <w:color w:val="222222"/>
                 <w:sz w:val="20"/>
               </w:rPr>
-              <w:t>Datos del módulo conformes al esquema (columnas y tipos).</w:t>
+              <w:t>Haber ejecutado los análisis de los flujos 3 a 5.</w:t>
             </w:r>
           </w:p>
         </w:tc>
@@ -3203,7 +3496,7 @@
                 <w:color w:val="222222"/>
                 <w:sz w:val="20"/>
               </w:rPr>
-              <w:t>1. Listar el catálogo de 30 consultas.</w:t>
+              <w:t>1. Volver al módulo Ventas.</w:t>
               <w:br/>
             </w:r>
             <w:r>
@@ -3212,7 +3505,7 @@
                 <w:color w:val="222222"/>
                 <w:sz w:val="20"/>
               </w:rPr>
-              <w:t>2. Enviar datos JSON al módulo → 10 reportes + tendencia.</w:t>
+              <w:t>2. Revisar la tabla del historial.</w:t>
               <w:br/>
             </w:r>
             <w:r>
@@ -3221,7 +3514,7 @@
                 <w:color w:val="222222"/>
                 <w:sz w:val="20"/>
               </w:rPr>
-              <w:t>3. Enviar datos con columnas/tipos inválidos → error de validación.</w:t>
+              <w:t>3. Pulsar «Ver resultados» de un análisis anterior.</w:t>
             </w:r>
           </w:p>
         </w:tc>
@@ -3260,7 +3553,7 @@
                 <w:color w:val="222222"/>
                 <w:sz w:val="20"/>
               </w:rPr>
-              <w:t>Aserciones</w:t>
+              <w:t>Comprobaciones</w:t>
             </w:r>
           </w:p>
         </w:tc>
@@ -3276,7 +3569,7 @@
                 <w:color w:val="222222"/>
                 <w:sz w:val="20"/>
               </w:rPr>
-              <w:t>10 reportes con métrica y modelo ganador; validación de tipos rechaza antes del motor; el fallo de una consulta no tumba el módulo (degradación).</w:t>
+              <w:t>El historial lista los análisis con fecha, filas y número de reportes; al abrirlo se muestran los valores predichos guardados (GET /v3/ventas/historial).</w:t>
             </w:r>
           </w:p>
         </w:tc>
@@ -3367,7 +3660,7 @@
                 <w:color w:val="222222"/>
                 <w:sz w:val="20"/>
               </w:rPr>
-              <w:t>FastAPI (crear_app) sobre TestClient de Starlette; base SQLite temporal por test (aislada, no toca la base real ni models/); datos del generador sintético del sistema (spc.synthetic); Supabase Storage deshabilitado (artefactos a disco temporal).</w:t>
+              <w:t>Selenium WebDriver 4 sobre Google Chrome real (ventana visible, resolución 1600×1000). La propia suite levanta el backend (uvicorn, spc.api.main:app) y el frontend (Vite) en puertos libres; el control de acceso está activo y la persistencia usa una base SQLite temporal por corrida (no toca la base real ni Supabase). Datos: los Excel del negocio de ejemplo examples/datos_excel_pyme/botica_farmasalud/.</w:t>
             </w:r>
           </w:p>
         </w:tc>
@@ -3402,7 +3695,7 @@
                 <w:color w:val="222222"/>
                 <w:sz w:val="20"/>
               </w:rPr>
-              <w:t>venv/Scripts/python -m pytest tests/api/ -v</w:t>
+              <w:t>venv/Scripts/python -m pytest tests/e2e_selenium -m selenium -v</w:t>
             </w:r>
           </w:p>
         </w:tc>
@@ -3437,12 +3730,57 @@
                 <w:color w:val="222222"/>
                 <w:sz w:val="20"/>
               </w:rPr>
-              <w:t>Ver final/evidencias/pruebas/e2e/</w:t>
+              <w:t>final/evidencias/pruebas/e2e_selenium/ (video, capturas y logs)</w:t>
             </w:r>
           </w:p>
         </w:tc>
       </w:tr>
     </w:tbl>
+    <w:p/>
+    <w:p>
+      <w:r>
+        <w:drawing>
+          <wp:inline xmlns:a="http://schemas.openxmlformats.org/drawingml/2006/main" xmlns:pic="http://schemas.openxmlformats.org/drawingml/2006/picture">
+            <wp:extent cx="5486400" cy="2700338"/>
+            <wp:docPr id="6" name="Picture 6"/>
+            <wp:cNvGraphicFramePr>
+              <a:graphicFrameLocks noChangeAspect="1"/>
+            </wp:cNvGraphicFramePr>
+            <a:graphic>
+              <a:graphicData uri="http://schemas.openxmlformats.org/drawingml/2006/picture">
+                <pic:pic>
+                  <pic:nvPicPr>
+                    <pic:cNvPr id="0" name="022_se_reabre_un_an_lisis_del_historial_y_se_ven_sus_resultados.png"/>
+                    <pic:cNvPicPr/>
+                  </pic:nvPicPr>
+                  <pic:blipFill>
+                    <a:blip r:embed="rId14"/>
+                    <a:stretch>
+                      <a:fillRect/>
+                    </a:stretch>
+                  </pic:blipFill>
+                  <pic:spPr>
+                    <a:xfrm>
+                      <a:off x="0" y="0"/>
+                      <a:ext cx="5486400" cy="2700338"/>
+                    </a:xfrm>
+                    <a:prstGeom prst="rect"/>
+                  </pic:spPr>
+                </pic:pic>
+              </a:graphicData>
+            </a:graphic>
+          </wp:inline>
+        </w:drawing>
+      </w:r>
+    </w:p>
+    <w:p>
+      <w:r>
+        <w:rPr>
+          <w:i/>
+        </w:rPr>
+        <w:t>Figura 6. Historial: los análisis quedan guardados y se pueden reabrir (captura de la corrida).</w:t>
+      </w:r>
+    </w:p>
     <w:p/>
     <w:p>
       <w:r>
@@ -3475,7 +3813,7 @@
                 <w:color w:val="FFFFFF"/>
                 <w:sz w:val="22"/>
               </w:rPr>
-              <w:t>Flujo 7 — Catálogo v3: carga por archivo (Excel/JSON) y demo</w:t>
+              <w:t>Flujo 7 — Administración: crear un rol con permisos y un usuario</w:t>
             </w:r>
           </w:p>
         </w:tc>
@@ -3510,7 +3848,7 @@
                 <w:color w:val="222222"/>
                 <w:sz w:val="20"/>
               </w:rPr>
-              <w:t>tests/api/test_ingesta_v3_archivo.py</w:t>
+              <w:t>tests/e2e_selenium/test_07_usuarios_roles.py</w:t>
             </w:r>
           </w:p>
         </w:tc>
@@ -3529,7 +3867,7 @@
                 <w:color w:val="222222"/>
                 <w:sz w:val="20"/>
               </w:rPr>
-              <w:t>Endpoints recorridos</w:t>
+              <w:t>Pantallas recorridas</w:t>
             </w:r>
           </w:p>
         </w:tc>
@@ -3545,7 +3883,7 @@
                 <w:color w:val="222222"/>
                 <w:sz w:val="20"/>
               </w:rPr>
-              <w:t>POST /v3/{modulo}/archivo, GET /v3/{modulo}/demo</w:t>
+              <w:t>Panel → Usuarios y permisos</w:t>
             </w:r>
           </w:p>
         </w:tc>
@@ -3580,7 +3918,7 @@
                 <w:color w:val="222222"/>
                 <w:sz w:val="20"/>
               </w:rPr>
-              <w:t>Archivo con las columnas del módulo (o inválido para los casos de error).</w:t>
+              <w:t>Sesión de administrador (único rol con la acción de administrar).</w:t>
             </w:r>
           </w:p>
         </w:tc>
@@ -3635,7 +3973,7 @@
                 <w:color w:val="222222"/>
                 <w:sz w:val="20"/>
               </w:rPr>
-              <w:t>1. Subir un Excel válido → corre el análisis (10 reportes).</w:t>
+              <w:t>1. Entrar a «Usuarios y permisos».</w:t>
               <w:br/>
             </w:r>
             <w:r>
@@ -3644,7 +3982,7 @@
                 <w:color w:val="222222"/>
                 <w:sz w:val="20"/>
               </w:rPr>
-              <w:t>2. Subir el JSON equivalente → mismo resultado.</w:t>
+              <w:t>2. Crear el rol e2e_rol con los tres módulos y la acción de predecir.</w:t>
               <w:br/>
             </w:r>
             <w:r>
@@ -3653,7 +3991,7 @@
                 <w:color w:val="222222"/>
                 <w:sz w:val="20"/>
               </w:rPr>
-              <w:t>3. Casos de error: módulo inexistente (400), formato no soportado (400), vacío (422), columnas faltantes (422), Excel corrupto (422).</w:t>
+              <w:t>3. Crear el usuario e2e_test con ese rol y un correo de contacto.</w:t>
               <w:br/>
             </w:r>
             <w:r>
@@ -3662,7 +4000,7 @@
                 <w:color w:val="222222"/>
                 <w:sz w:val="20"/>
               </w:rPr>
-              <w:t>4. Ejecutar la demo v3 de cada módulo.</w:t>
+              <w:t>4. Comprobar las tablas de roles y usuarios.</w:t>
             </w:r>
           </w:p>
         </w:tc>
@@ -3701,7 +4039,7 @@
                 <w:color w:val="222222"/>
                 <w:sz w:val="20"/>
               </w:rPr>
-              <w:t>Aserciones</w:t>
+              <w:t>Comprobaciones</w:t>
             </w:r>
           </w:p>
         </w:tc>
@@ -3717,7 +4055,7 @@
                 <w:color w:val="222222"/>
                 <w:sz w:val="20"/>
               </w:rPr>
-              <w:t>Excel y JSON válidos devuelven module + reports + dataset_info; los errores dan el código correcto sin 500; la demo trae reportes y tendencia.</w:t>
+              <w:t>El rol y el usuario quedan persistidos y aparecen en las tablas; el usuario figura como Activo y con su correo; el backend registra POST /roles y POST /users.</w:t>
             </w:r>
           </w:p>
         </w:tc>
@@ -3808,7 +4146,7 @@
                 <w:color w:val="222222"/>
                 <w:sz w:val="20"/>
               </w:rPr>
-              <w:t>FastAPI (crear_app) sobre TestClient de Starlette; base SQLite temporal por test (aislada, no toca la base real ni models/); datos del generador sintético del sistema (spc.synthetic); Supabase Storage deshabilitado (artefactos a disco temporal).</w:t>
+              <w:t>Selenium WebDriver 4 sobre Google Chrome real (ventana visible, resolución 1600×1000). La propia suite levanta el backend (uvicorn, spc.api.main:app) y el frontend (Vite) en puertos libres; el control de acceso está activo y la persistencia usa una base SQLite temporal por corrida (no toca la base real ni Supabase). Datos: los Excel del negocio de ejemplo examples/datos_excel_pyme/botica_farmasalud/.</w:t>
             </w:r>
           </w:p>
         </w:tc>
@@ -3843,7 +4181,7 @@
                 <w:color w:val="222222"/>
                 <w:sz w:val="20"/>
               </w:rPr>
-              <w:t>venv/Scripts/python -m pytest tests/api/ -v</w:t>
+              <w:t>venv/Scripts/python -m pytest tests/e2e_selenium -m selenium -v</w:t>
             </w:r>
           </w:p>
         </w:tc>
@@ -3878,12 +4216,57 @@
                 <w:color w:val="222222"/>
                 <w:sz w:val="20"/>
               </w:rPr>
-              <w:t>Ver final/evidencias/pruebas/e2e/</w:t>
+              <w:t>final/evidencias/pruebas/e2e_selenium/ (video, capturas y logs)</w:t>
             </w:r>
           </w:p>
         </w:tc>
       </w:tr>
     </w:tbl>
+    <w:p/>
+    <w:p>
+      <w:r>
+        <w:drawing>
+          <wp:inline xmlns:a="http://schemas.openxmlformats.org/drawingml/2006/main" xmlns:pic="http://schemas.openxmlformats.org/drawingml/2006/picture">
+            <wp:extent cx="5486400" cy="2700338"/>
+            <wp:docPr id="7" name="Picture 7"/>
+            <wp:cNvGraphicFramePr>
+              <a:graphicFrameLocks noChangeAspect="1"/>
+            </wp:cNvGraphicFramePr>
+            <a:graphic>
+              <a:graphicData uri="http://schemas.openxmlformats.org/drawingml/2006/picture">
+                <pic:pic>
+                  <pic:nvPicPr>
+                    <pic:cNvPr id="0" name="027_el_usuario_aparece_en_la_tabla_e2e_test_e2e_test_ejemplo_com.png"/>
+                    <pic:cNvPicPr/>
+                  </pic:nvPicPr>
+                  <pic:blipFill>
+                    <a:blip r:embed="rId15"/>
+                    <a:stretch>
+                      <a:fillRect/>
+                    </a:stretch>
+                  </pic:blipFill>
+                  <pic:spPr>
+                    <a:xfrm>
+                      <a:off x="0" y="0"/>
+                      <a:ext cx="5486400" cy="2700338"/>
+                    </a:xfrm>
+                    <a:prstGeom prst="rect"/>
+                  </pic:spPr>
+                </pic:pic>
+              </a:graphicData>
+            </a:graphic>
+          </wp:inline>
+        </w:drawing>
+      </w:r>
+    </w:p>
+    <w:p>
+      <w:r>
+        <w:rPr>
+          <w:i/>
+        </w:rPr>
+        <w:t>Figura 7. Administración: crear un rol con permisos y un usuario (captura de la corrida).</w:t>
+      </w:r>
+    </w:p>
     <w:p/>
     <w:p>
       <w:r>
@@ -3916,7 +4299,7 @@
                 <w:color w:val="FFFFFF"/>
                 <w:sz w:val="22"/>
               </w:rPr>
-              <w:t>Flujo 8 — Historial de análisis y detalle</w:t>
+              <w:t>Flujo 8 — Usuario nuevo: onboarding, permisos aplicados y datos aislados</w:t>
             </w:r>
           </w:p>
         </w:tc>
@@ -3951,7 +4334,7 @@
                 <w:color w:val="222222"/>
                 <w:sz w:val="20"/>
               </w:rPr>
-              <w:t>tests/api/test_historial_v3.py</w:t>
+              <w:t>tests/e2e_selenium/test_08_rbac_usuario_nuevo.py</w:t>
             </w:r>
           </w:p>
         </w:tc>
@@ -3970,7 +4353,7 @@
                 <w:color w:val="222222"/>
                 <w:sz w:val="20"/>
               </w:rPr>
-              <w:t>Endpoints recorridos</w:t>
+              <w:t>Pantallas recorridas</w:t>
             </w:r>
           </w:p>
         </w:tc>
@@ -3986,7 +4369,7 @@
                 <w:color w:val="222222"/>
                 <w:sz w:val="20"/>
               </w:rPr>
-              <w:t>GET /v3/{modulo}/historial, GET /v3/historial/{prediction_id}</w:t>
+              <w:t>Login → Onboarding → Panel (menú recortado) → Ventas</w:t>
             </w:r>
           </w:p>
         </w:tc>
@@ -4021,7 +4404,7 @@
                 <w:color w:val="222222"/>
                 <w:sz w:val="20"/>
               </w:rPr>
-              <w:t>Al menos un análisis ejecutado (persistencia conectada).</w:t>
+              <w:t>El usuario e2e_test creado en el flujo 7.</w:t>
             </w:r>
           </w:p>
         </w:tc>
@@ -4076,7 +4459,7 @@
                 <w:color w:val="222222"/>
                 <w:sz w:val="20"/>
               </w:rPr>
-              <w:t>1. Ejecutar análisis para poblar el historial.</w:t>
+              <w:t>1. Ingresar como e2e_test (primer ingreso).</w:t>
               <w:br/>
             </w:r>
             <w:r>
@@ -4085,7 +4468,7 @@
                 <w:color w:val="222222"/>
                 <w:sz w:val="20"/>
               </w:rPr>
-              <w:t>2. Listar el historial del módulo (más recientes primero).</w:t>
+              <w:t>2. Completar el onboarding del negocio (nombre, sector, tamaño, región y moneda).</w:t>
               <w:br/>
             </w:r>
             <w:r>
@@ -4094,7 +4477,16 @@
                 <w:color w:val="222222"/>
                 <w:sz w:val="20"/>
               </w:rPr>
-              <w:t>3. Abrir el detalle de una predicción; probar un id inexistente/ajeno.</w:t>
+              <w:t>3. Revisar el menú y escribir a mano la ruta /users.</w:t>
+              <w:br/>
+            </w:r>
+            <w:r>
+              <w:rPr>
+                <w:b w:val="0"/>
+                <w:color w:val="222222"/>
+                <w:sz w:val="20"/>
+              </w:rPr>
+              <w:t>4. Abrir Ventas, revisar el historial y generar su propio pronóstico.</w:t>
             </w:r>
           </w:p>
         </w:tc>
@@ -4133,7 +4525,7 @@
                 <w:color w:val="222222"/>
                 <w:sz w:val="20"/>
               </w:rPr>
-              <w:t>Aserciones</w:t>
+              <w:t>Comprobaciones</w:t>
             </w:r>
           </w:p>
         </w:tc>
@@ -4149,7 +4541,7 @@
                 <w:color w:val="222222"/>
                 <w:sz w:val="20"/>
               </w:rPr>
-              <w:t>El historial lista las ejecuciones con métricas resumidas; el detalle trae los valores predichos; id inexistente/ajeno → 404.</w:t>
+              <w:t>El menú no muestra «Usuarios y permisos» y la ruta escrita a mano redirige (el permiso se aplica de verdad); el historial de la cuenta nueva arranca vacío — los datos del administrador no se filtran — y su análisis devuelve los 10 reportes.</w:t>
             </w:r>
           </w:p>
         </w:tc>
@@ -4240,7 +4632,7 @@
                 <w:color w:val="222222"/>
                 <w:sz w:val="20"/>
               </w:rPr>
-              <w:t>FastAPI (crear_app) sobre TestClient de Starlette; base SQLite temporal por test (aislada, no toca la base real ni models/); datos del generador sintético del sistema (spc.synthetic); Supabase Storage deshabilitado (artefactos a disco temporal).</w:t>
+              <w:t>Selenium WebDriver 4 sobre Google Chrome real (ventana visible, resolución 1600×1000). La propia suite levanta el backend (uvicorn, spc.api.main:app) y el frontend (Vite) en puertos libres; el control de acceso está activo y la persistencia usa una base SQLite temporal por corrida (no toca la base real ni Supabase). Datos: los Excel del negocio de ejemplo examples/datos_excel_pyme/botica_farmasalud/.</w:t>
             </w:r>
           </w:p>
         </w:tc>
@@ -4275,7 +4667,7 @@
                 <w:color w:val="222222"/>
                 <w:sz w:val="20"/>
               </w:rPr>
-              <w:t>venv/Scripts/python -m pytest tests/api/ -v</w:t>
+              <w:t>venv/Scripts/python -m pytest tests/e2e_selenium -m selenium -v</w:t>
             </w:r>
           </w:p>
         </w:tc>
@@ -4310,12 +4702,57 @@
                 <w:color w:val="222222"/>
                 <w:sz w:val="20"/>
               </w:rPr>
-              <w:t>Ver final/evidencias/pruebas/e2e/</w:t>
+              <w:t>final/evidencias/pruebas/e2e_selenium/ (video, capturas y logs)</w:t>
             </w:r>
           </w:p>
         </w:tc>
       </w:tr>
     </w:tbl>
+    <w:p/>
+    <w:p>
+      <w:r>
+        <w:drawing>
+          <wp:inline xmlns:a="http://schemas.openxmlformats.org/drawingml/2006/main" xmlns:pic="http://schemas.openxmlformats.org/drawingml/2006/picture">
+            <wp:extent cx="5486400" cy="2700338"/>
+            <wp:docPr id="8" name="Picture 8"/>
+            <wp:cNvGraphicFramePr>
+              <a:graphicFrameLocks noChangeAspect="1"/>
+            </wp:cNvGraphicFramePr>
+            <a:graphic>
+              <a:graphicData uri="http://schemas.openxmlformats.org/drawingml/2006/picture">
+                <pic:pic>
+                  <pic:nvPicPr>
+                    <pic:cNvPr id="0" name="030_secciones_visibles_para_su_rol_home_sales_purchases_inventor.png"/>
+                    <pic:cNvPicPr/>
+                  </pic:nvPicPr>
+                  <pic:blipFill>
+                    <a:blip r:embed="rId16"/>
+                    <a:stretch>
+                      <a:fillRect/>
+                    </a:stretch>
+                  </pic:blipFill>
+                  <pic:spPr>
+                    <a:xfrm>
+                      <a:off x="0" y="0"/>
+                      <a:ext cx="5486400" cy="2700338"/>
+                    </a:xfrm>
+                    <a:prstGeom prst="rect"/>
+                  </pic:spPr>
+                </pic:pic>
+              </a:graphicData>
+            </a:graphic>
+          </wp:inline>
+        </w:drawing>
+      </w:r>
+    </w:p>
+    <w:p>
+      <w:r>
+        <w:rPr>
+          <w:i/>
+        </w:rPr>
+        <w:t>Figura 8. Usuario nuevo: onboarding, permisos aplicados y datos aislados (captura de la corrida).</w:t>
+      </w:r>
+    </w:p>
     <w:p/>
     <w:p>
       <w:r>
@@ -4348,7 +4785,7 @@
                 <w:color w:val="FFFFFF"/>
                 <w:sz w:val="22"/>
               </w:rPr>
-              <w:t>Flujo 9 — Validación de tipos a nivel de API (v3)</w:t>
+              <w:t>Flujo 9 — Restablecer la contraseña de punta a punta con el enlace</w:t>
             </w:r>
           </w:p>
         </w:tc>
@@ -4383,7 +4820,7 @@
                 <w:color w:val="222222"/>
                 <w:sz w:val="20"/>
               </w:rPr>
-              <w:t>tests/api/test_validacion_v3_api.py</w:t>
+              <w:t>tests/e2e_selenium/test_09_reset_password_completo.py</w:t>
             </w:r>
           </w:p>
         </w:tc>
@@ -4402,7 +4839,7 @@
                 <w:color w:val="222222"/>
                 <w:sz w:val="20"/>
               </w:rPr>
-              <w:t>Endpoints recorridos</w:t>
+              <w:t>Pantallas recorridas</w:t>
             </w:r>
           </w:p>
         </w:tc>
@@ -4418,7 +4855,7 @@
                 <w:color w:val="222222"/>
                 <w:sz w:val="20"/>
               </w:rPr>
-              <w:t>POST /v3/{modulo}</w:t>
+              <w:t>Login → ¿Olvidaste tu contraseña? → /reset?token=… → Login</w:t>
             </w:r>
           </w:p>
         </w:tc>
@@ -4453,7 +4890,7 @@
                 <w:color w:val="222222"/>
                 <w:sz w:val="20"/>
               </w:rPr>
-              <w:t>Datos con una columna de tipo incorrecto.</w:t>
+              <w:t>Cuenta con correo (e2e_test); SMTP en modo desarrollo (enlace al log).</w:t>
             </w:r>
           </w:p>
         </w:tc>
@@ -4508,7 +4945,7 @@
                 <w:color w:val="222222"/>
                 <w:sz w:val="20"/>
               </w:rPr>
-              <w:t>1. Enviar datos con fecha no parseable o número con texto.</w:t>
+              <w:t>1. Solicitar el enlace desde el login con el correo de la cuenta.</w:t>
               <w:br/>
             </w:r>
             <w:r>
@@ -4517,7 +4954,25 @@
                 <w:color w:val="222222"/>
                 <w:sz w:val="20"/>
               </w:rPr>
-              <w:t>2. Recibir el rechazo con detalle por columna/fila.</w:t>
+              <w:t>2. Tomar el enlace emitido por el servidor y abrirlo en el navegador.</w:t>
+              <w:br/>
+            </w:r>
+            <w:r>
+              <w:rPr>
+                <w:b w:val="0"/>
+                <w:color w:val="222222"/>
+                <w:sz w:val="20"/>
+              </w:rPr>
+              <w:t>3. Fijar la contraseña nueva y confirmarla.</w:t>
+              <w:br/>
+            </w:r>
+            <w:r>
+              <w:rPr>
+                <w:b w:val="0"/>
+                <w:color w:val="222222"/>
+                <w:sz w:val="20"/>
+              </w:rPr>
+              <w:t>4. Reutilizar el mismo enlace y volver a ingresar con la contraseña nueva.</w:t>
             </w:r>
           </w:p>
         </w:tc>
@@ -4556,7 +5011,7 @@
                 <w:color w:val="222222"/>
                 <w:sz w:val="20"/>
               </w:rPr>
-              <w:t>Aserciones</w:t>
+              <w:t>Comprobaciones</w:t>
             </w:r>
           </w:p>
         </w:tc>
@@ -4572,7 +5027,7 @@
                 <w:color w:val="222222"/>
                 <w:sz w:val="20"/>
               </w:rPr>
-              <w:t>422 con el detalle de la columna/fila inválida; no hay coerción silenciosa.</w:t>
+              <w:t>El enlace permite fijar la contraseña una sola vez: el segundo intento se rechaza; la cuenta entra con la contraseña nueva.</w:t>
             </w:r>
           </w:p>
         </w:tc>
@@ -4663,7 +5118,7 @@
                 <w:color w:val="222222"/>
                 <w:sz w:val="20"/>
               </w:rPr>
-              <w:t>FastAPI (crear_app) sobre TestClient de Starlette; base SQLite temporal por test (aislada, no toca la base real ni models/); datos del generador sintético del sistema (spc.synthetic); Supabase Storage deshabilitado (artefactos a disco temporal).</w:t>
+              <w:t>Selenium WebDriver 4 sobre Google Chrome real (ventana visible, resolución 1600×1000). La propia suite levanta el backend (uvicorn, spc.api.main:app) y el frontend (Vite) en puertos libres; el control de acceso está activo y la persistencia usa una base SQLite temporal por corrida (no toca la base real ni Supabase). Datos: los Excel del negocio de ejemplo examples/datos_excel_pyme/botica_farmasalud/.</w:t>
             </w:r>
           </w:p>
         </w:tc>
@@ -4698,7 +5153,7 @@
                 <w:color w:val="222222"/>
                 <w:sz w:val="20"/>
               </w:rPr>
-              <w:t>venv/Scripts/python -m pytest tests/api/ -v</w:t>
+              <w:t>venv/Scripts/python -m pytest tests/e2e_selenium -m selenium -v</w:t>
             </w:r>
           </w:p>
         </w:tc>
@@ -4733,12 +5188,57 @@
                 <w:color w:val="222222"/>
                 <w:sz w:val="20"/>
               </w:rPr>
-              <w:t>Ver final/evidencias/pruebas/e2e/</w:t>
+              <w:t>final/evidencias/pruebas/e2e_selenium/ (video, capturas y logs)</w:t>
             </w:r>
           </w:p>
         </w:tc>
       </w:tr>
     </w:tbl>
+    <w:p/>
+    <w:p>
+      <w:r>
+        <w:drawing>
+          <wp:inline xmlns:a="http://schemas.openxmlformats.org/drawingml/2006/main" xmlns:pic="http://schemas.openxmlformats.org/drawingml/2006/picture">
+            <wp:extent cx="5486400" cy="2700338"/>
+            <wp:docPr id="9" name="Picture 9"/>
+            <wp:cNvGraphicFramePr>
+              <a:graphicFrameLocks noChangeAspect="1"/>
+            </wp:cNvGraphicFramePr>
+            <a:graphic>
+              <a:graphicData uri="http://schemas.openxmlformats.org/drawingml/2006/picture">
+                <pic:pic>
+                  <pic:nvPicPr>
+                    <pic:cNvPr id="0" name="036_se_fija_la_nueva_contrase_a_desde_el_enlace_del_correo.png"/>
+                    <pic:cNvPicPr/>
+                  </pic:nvPicPr>
+                  <pic:blipFill>
+                    <a:blip r:embed="rId17"/>
+                    <a:stretch>
+                      <a:fillRect/>
+                    </a:stretch>
+                  </pic:blipFill>
+                  <pic:spPr>
+                    <a:xfrm>
+                      <a:off x="0" y="0"/>
+                      <a:ext cx="5486400" cy="2700338"/>
+                    </a:xfrm>
+                    <a:prstGeom prst="rect"/>
+                  </pic:spPr>
+                </pic:pic>
+              </a:graphicData>
+            </a:graphic>
+          </wp:inline>
+        </w:drawing>
+      </w:r>
+    </w:p>
+    <w:p>
+      <w:r>
+        <w:rPr>
+          <w:i/>
+        </w:rPr>
+        <w:t>Figura 9. Restablecer la contraseña de punta a punta con el enlace (captura de la corrida).</w:t>
+      </w:r>
+    </w:p>
     <w:p/>
     <w:p>
       <w:r>
@@ -4771,7 +5271,7 @@
                 <w:color w:val="FFFFFF"/>
                 <w:sz w:val="22"/>
               </w:rPr>
-              <w:t>Flujo 10 — Perfil de negocio, CORS y forma uniforme de error</w:t>
+              <w:t>Flujo 10 — Recorrido por todas las secciones y «Acerca del sistema»</w:t>
             </w:r>
           </w:p>
         </w:tc>
@@ -4806,7 +5306,7 @@
                 <w:color w:val="222222"/>
                 <w:sz w:val="20"/>
               </w:rPr>
-              <w:t>tests/api/test_auth.py (perfil) / test_cors.py / test_errores_api.py</w:t>
+              <w:t>tests/e2e_selenium/test_10_navegacion.py</w:t>
             </w:r>
           </w:p>
         </w:tc>
@@ -4825,7 +5325,7 @@
                 <w:color w:val="222222"/>
                 <w:sz w:val="20"/>
               </w:rPr>
-              <w:t>Endpoints recorridos</w:t>
+              <w:t>Pantallas recorridas</w:t>
             </w:r>
           </w:p>
         </w:tc>
@@ -4841,7 +5341,7 @@
                 <w:color w:val="222222"/>
                 <w:sz w:val="20"/>
               </w:rPr>
-              <w:t>GET/PUT /profile, GET /profile/options, GET /health, GET /openapi.json</w:t>
+              <w:t>Inicio, Ventas, Compras, Almacén, Usuarios, Acerca del sistema</w:t>
             </w:r>
           </w:p>
         </w:tc>
@@ -4876,7 +5376,7 @@
                 <w:color w:val="222222"/>
                 <w:sz w:val="20"/>
               </w:rPr>
-              <w:t>App levantada; origen del frontend permitido.</w:t>
+              <w:t>Sesión de administrador.</w:t>
             </w:r>
           </w:p>
         </w:tc>
@@ -4931,7 +5431,7 @@
                 <w:color w:val="222222"/>
                 <w:sz w:val="20"/>
               </w:rPr>
-              <w:t>1. Leer y guardar el perfil de onboarding; opciones válidas del formulario.</w:t>
+              <w:t>1. Recorrer una por una las secciones del menú.</w:t>
               <w:br/>
             </w:r>
             <w:r>
@@ -4940,7 +5440,7 @@
                 <w:color w:val="222222"/>
                 <w:sz w:val="20"/>
               </w:rPr>
-              <w:t>2. Preflight CORS desde el origen del frontend.</w:t>
+              <w:t>2. Comprobar que cada sección carga contenido.</w:t>
               <w:br/>
             </w:r>
             <w:r>
@@ -4949,7 +5449,16 @@
                 <w:color w:val="222222"/>
                 <w:sz w:val="20"/>
               </w:rPr>
-              <w:t>3. Provocar un error y verificar el sobre uniforme; consultar /health y Swagger.</w:t>
+              <w:t>3. Abrir «Acerca del sistema».</w:t>
+              <w:br/>
+            </w:r>
+            <w:r>
+              <w:rPr>
+                <w:b w:val="0"/>
+                <w:color w:val="222222"/>
+                <w:sz w:val="20"/>
+              </w:rPr>
+              <w:t>4. Revisar la consola del navegador.</w:t>
             </w:r>
           </w:p>
         </w:tc>
@@ -4988,7 +5497,7 @@
                 <w:color w:val="222222"/>
                 <w:sz w:val="20"/>
               </w:rPr>
-              <w:t>Aserciones</w:t>
+              <w:t>Comprobaciones</w:t>
             </w:r>
           </w:p>
         </w:tc>
@@ -5004,7 +5513,7 @@
                 <w:color w:val="222222"/>
                 <w:sz w:val="20"/>
               </w:rPr>
-              <w:t>Perfil persistido; cabeceras CORS correctas; /health ok; error con forma uniforme; OpenAPI disponible.</w:t>
+              <w:t>Ninguna sección queda en blanco; «Acerca del sistema» explica el funcionamiento y la exactitud; la consola no acumula errores de la aplicación.</w:t>
             </w:r>
           </w:p>
         </w:tc>
@@ -5095,7 +5604,7 @@
                 <w:color w:val="222222"/>
                 <w:sz w:val="20"/>
               </w:rPr>
-              <w:t>FastAPI (crear_app) sobre TestClient de Starlette; base SQLite temporal por test (aislada, no toca la base real ni models/); datos del generador sintético del sistema (spc.synthetic); Supabase Storage deshabilitado (artefactos a disco temporal).</w:t>
+              <w:t>Selenium WebDriver 4 sobre Google Chrome real (ventana visible, resolución 1600×1000). La propia suite levanta el backend (uvicorn, spc.api.main:app) y el frontend (Vite) en puertos libres; el control de acceso está activo y la persistencia usa una base SQLite temporal por corrida (no toca la base real ni Supabase). Datos: los Excel del negocio de ejemplo examples/datos_excel_pyme/botica_farmasalud/.</w:t>
             </w:r>
           </w:p>
         </w:tc>
@@ -5130,7 +5639,7 @@
                 <w:color w:val="222222"/>
                 <w:sz w:val="20"/>
               </w:rPr>
-              <w:t>venv/Scripts/python -m pytest tests/api/ -v</w:t>
+              <w:t>venv/Scripts/python -m pytest tests/e2e_selenium -m selenium -v</w:t>
             </w:r>
           </w:p>
         </w:tc>
@@ -5165,12 +5674,534 @@
                 <w:color w:val="222222"/>
                 <w:sz w:val="20"/>
               </w:rPr>
-              <w:t>Ver final/evidencias/pruebas/e2e/</w:t>
+              <w:t>final/evidencias/pruebas/e2e_selenium/ (video, capturas y logs)</w:t>
             </w:r>
           </w:p>
         </w:tc>
       </w:tr>
     </w:tbl>
+    <w:p/>
+    <w:p>
+      <w:r>
+        <w:drawing>
+          <wp:inline xmlns:a="http://schemas.openxmlformats.org/drawingml/2006/main" xmlns:pic="http://schemas.openxmlformats.org/drawingml/2006/picture">
+            <wp:extent cx="5486400" cy="2700338"/>
+            <wp:docPr id="10" name="Picture 10"/>
+            <wp:cNvGraphicFramePr>
+              <a:graphicFrameLocks noChangeAspect="1"/>
+            </wp:cNvGraphicFramePr>
+            <a:graphic>
+              <a:graphicData uri="http://schemas.openxmlformats.org/drawingml/2006/picture">
+                <pic:pic>
+                  <pic:nvPicPr>
+                    <pic:cNvPr id="0" name="003_ingreso_correcto_como_administrador_256370_se_muestra_el_pan.png"/>
+                    <pic:cNvPicPr/>
+                  </pic:nvPicPr>
+                  <pic:blipFill>
+                    <a:blip r:embed="rId9"/>
+                    <a:stretch>
+                      <a:fillRect/>
+                    </a:stretch>
+                  </pic:blipFill>
+                  <pic:spPr>
+                    <a:xfrm>
+                      <a:off x="0" y="0"/>
+                      <a:ext cx="5486400" cy="2700338"/>
+                    </a:xfrm>
+                    <a:prstGeom prst="rect"/>
+                  </pic:spPr>
+                </pic:pic>
+              </a:graphicData>
+            </a:graphic>
+          </wp:inline>
+        </w:drawing>
+      </w:r>
+    </w:p>
+    <w:p>
+      <w:r>
+        <w:rPr>
+          <w:i/>
+        </w:rPr>
+        <w:t>Figura 10. Recorrido por todas las secciones y «Acerca del sistema» (captura de la corrida).</w:t>
+      </w:r>
+    </w:p>
+    <w:p/>
+    <w:p>
+      <w:r>
+        <w:br w:type="page"/>
+      </w:r>
+    </w:p>
+    <w:tbl>
+      <w:tblPr>
+        <w:tblStyle w:val="TableGrid"/>
+        <w:tblW w:type="auto" w:w="0"/>
+        <w:jc w:val="center"/>
+        <w:tblLook w:firstColumn="1" w:firstRow="1" w:lastColumn="0" w:lastRow="0" w:noHBand="0" w:noVBand="1" w:val="04A0"/>
+      </w:tblPr>
+      <w:tblGrid>
+        <w:gridCol w:w="4320"/>
+        <w:gridCol w:w="4320"/>
+      </w:tblGrid>
+      <w:tr>
+        <w:tc>
+          <w:tcPr>
+            <w:tcW w:type="dxa" w:w="8640"/>
+            <w:gridSpan w:val="2"/>
+            <w:shd w:val="clear" w:color="auto" w:fill="1F4E79"/>
+          </w:tcPr>
+          <w:p>
+            <w:r/>
+            <w:r>
+              <w:rPr>
+                <w:b/>
+                <w:color w:val="FFFFFF"/>
+                <w:sz w:val="22"/>
+              </w:rPr>
+              <w:t>Flujo 11 — Errores de carga explicados, sin caídas</w:t>
+            </w:r>
+          </w:p>
+        </w:tc>
+      </w:tr>
+      <w:tr>
+        <w:tc>
+          <w:tcPr>
+            <w:tcW w:type="dxa" w:w="4320"/>
+            <w:shd w:val="clear" w:color="auto" w:fill="D6E4F0"/>
+          </w:tcPr>
+          <w:p>
+            <w:r/>
+            <w:r>
+              <w:rPr>
+                <w:b/>
+                <w:color w:val="222222"/>
+                <w:sz w:val="20"/>
+              </w:rPr>
+              <w:t>Archivo de prueba</w:t>
+            </w:r>
+          </w:p>
+        </w:tc>
+        <w:tc>
+          <w:tcPr>
+            <w:tcW w:type="dxa" w:w="4320"/>
+          </w:tcPr>
+          <w:p>
+            <w:r/>
+            <w:r>
+              <w:rPr>
+                <w:b w:val="0"/>
+                <w:color w:val="222222"/>
+                <w:sz w:val="20"/>
+              </w:rPr>
+              <w:t>tests/e2e_selenium/test_11_errores_carga.py</w:t>
+            </w:r>
+          </w:p>
+        </w:tc>
+      </w:tr>
+      <w:tr>
+        <w:tc>
+          <w:tcPr>
+            <w:tcW w:type="dxa" w:w="4320"/>
+            <w:shd w:val="clear" w:color="auto" w:fill="D6E4F0"/>
+          </w:tcPr>
+          <w:p>
+            <w:r/>
+            <w:r>
+              <w:rPr>
+                <w:b/>
+                <w:color w:val="222222"/>
+                <w:sz w:val="20"/>
+              </w:rPr>
+              <w:t>Pantallas recorridas</w:t>
+            </w:r>
+          </w:p>
+        </w:tc>
+        <w:tc>
+          <w:tcPr>
+            <w:tcW w:type="dxa" w:w="4320"/>
+          </w:tcPr>
+          <w:p>
+            <w:r/>
+            <w:r>
+              <w:rPr>
+                <w:b w:val="0"/>
+                <w:color w:val="222222"/>
+                <w:sz w:val="20"/>
+              </w:rPr>
+              <w:t>Ventas → Paso 3 (subida de archivo)</w:t>
+            </w:r>
+          </w:p>
+        </w:tc>
+      </w:tr>
+      <w:tr>
+        <w:tc>
+          <w:tcPr>
+            <w:tcW w:type="dxa" w:w="4320"/>
+            <w:shd w:val="clear" w:color="auto" w:fill="D6E4F0"/>
+          </w:tcPr>
+          <w:p>
+            <w:r/>
+            <w:r>
+              <w:rPr>
+                <w:b/>
+                <w:color w:val="222222"/>
+                <w:sz w:val="20"/>
+              </w:rPr>
+              <w:t>Precondición</w:t>
+            </w:r>
+          </w:p>
+        </w:tc>
+        <w:tc>
+          <w:tcPr>
+            <w:tcW w:type="dxa" w:w="4320"/>
+          </w:tcPr>
+          <w:p>
+            <w:r/>
+            <w:r>
+              <w:rPr>
+                <w:b w:val="0"/>
+                <w:color w:val="222222"/>
+                <w:sz w:val="20"/>
+              </w:rPr>
+              <w:t>Sesión de administrador; un .txt y un .xlsx corrupto.</w:t>
+            </w:r>
+          </w:p>
+        </w:tc>
+      </w:tr>
+      <w:tr>
+        <w:tc>
+          <w:tcPr>
+            <w:tcW w:type="dxa" w:w="8640"/>
+            <w:gridSpan w:val="2"/>
+            <w:shd w:val="clear" w:color="auto" w:fill="2E75B6"/>
+          </w:tcPr>
+          <w:p>
+            <w:r/>
+            <w:r>
+              <w:rPr>
+                <w:b/>
+                <w:color w:val="FFFFFF"/>
+                <w:sz w:val="20"/>
+              </w:rPr>
+              <w:t>PASOS</w:t>
+            </w:r>
+          </w:p>
+        </w:tc>
+      </w:tr>
+      <w:tr>
+        <w:tc>
+          <w:tcPr>
+            <w:tcW w:type="dxa" w:w="4320"/>
+            <w:shd w:val="clear" w:color="auto" w:fill="D6E4F0"/>
+          </w:tcPr>
+          <w:p>
+            <w:r/>
+            <w:r>
+              <w:rPr>
+                <w:b/>
+                <w:color w:val="222222"/>
+                <w:sz w:val="20"/>
+              </w:rPr>
+              <w:t>Procedimiento</w:t>
+            </w:r>
+          </w:p>
+        </w:tc>
+        <w:tc>
+          <w:tcPr>
+            <w:tcW w:type="dxa" w:w="4320"/>
+          </w:tcPr>
+          <w:p>
+            <w:r/>
+            <w:r>
+              <w:rPr>
+                <w:b w:val="0"/>
+                <w:color w:val="222222"/>
+                <w:sz w:val="20"/>
+              </w:rPr>
+              <w:t>1. Subir un archivo .txt (extensión no admitida).</w:t>
+              <w:br/>
+            </w:r>
+            <w:r>
+              <w:rPr>
+                <w:b w:val="0"/>
+                <w:color w:val="222222"/>
+                <w:sz w:val="20"/>
+              </w:rPr>
+              <w:t>2. Subir un .xlsx corrupto.</w:t>
+              <w:br/>
+            </w:r>
+            <w:r>
+              <w:rPr>
+                <w:b w:val="0"/>
+                <w:color w:val="222222"/>
+                <w:sz w:val="20"/>
+              </w:rPr>
+              <w:t>3. Seguir usando la aplicación.</w:t>
+            </w:r>
+          </w:p>
+        </w:tc>
+      </w:tr>
+      <w:tr>
+        <w:tc>
+          <w:tcPr>
+            <w:tcW w:type="dxa" w:w="8640"/>
+            <w:gridSpan w:val="2"/>
+            <w:shd w:val="clear" w:color="auto" w:fill="2E75B6"/>
+          </w:tcPr>
+          <w:p>
+            <w:r/>
+            <w:r>
+              <w:rPr>
+                <w:b/>
+                <w:color w:val="FFFFFF"/>
+                <w:sz w:val="20"/>
+              </w:rPr>
+              <w:t>VERIFICACIÓN</w:t>
+            </w:r>
+          </w:p>
+        </w:tc>
+      </w:tr>
+      <w:tr>
+        <w:tc>
+          <w:tcPr>
+            <w:tcW w:type="dxa" w:w="4320"/>
+            <w:shd w:val="clear" w:color="auto" w:fill="D6E4F0"/>
+          </w:tcPr>
+          <w:p>
+            <w:r/>
+            <w:r>
+              <w:rPr>
+                <w:b/>
+                <w:color w:val="222222"/>
+                <w:sz w:val="20"/>
+              </w:rPr>
+              <w:t>Comprobaciones</w:t>
+            </w:r>
+          </w:p>
+        </w:tc>
+        <w:tc>
+          <w:tcPr>
+            <w:tcW w:type="dxa" w:w="4320"/>
+          </w:tcPr>
+          <w:p>
+            <w:r/>
+            <w:r>
+              <w:rPr>
+                <w:b w:val="0"/>
+                <w:color w:val="222222"/>
+                <w:sz w:val="20"/>
+              </w:rPr>
+              <w:t>El .txt lo rechaza la interfaz con un aviso claro; el Excel corrupto devuelve un error controlado (422, no 500) que se muestra en el panel de error; la aplicación sigue operativa, sin pantalla en blanco.</w:t>
+            </w:r>
+          </w:p>
+        </w:tc>
+      </w:tr>
+      <w:tr>
+        <w:tc>
+          <w:tcPr>
+            <w:tcW w:type="dxa" w:w="4320"/>
+            <w:shd w:val="clear" w:color="auto" w:fill="D6E4F0"/>
+          </w:tcPr>
+          <w:p>
+            <w:r/>
+            <w:r>
+              <w:rPr>
+                <w:b/>
+                <w:color w:val="222222"/>
+                <w:sz w:val="20"/>
+              </w:rPr>
+              <w:t>Resultado</w:t>
+            </w:r>
+          </w:p>
+        </w:tc>
+        <w:tc>
+          <w:tcPr>
+            <w:tcW w:type="dxa" w:w="4320"/>
+            <w:shd w:val="clear" w:color="auto" w:fill="E2EFDA"/>
+          </w:tcPr>
+          <w:p>
+            <w:r/>
+            <w:r>
+              <w:rPr>
+                <w:b w:val="0"/>
+                <w:color w:val="222222"/>
+                <w:sz w:val="20"/>
+              </w:rPr>
+              <w:t>PASA</w:t>
+            </w:r>
+          </w:p>
+        </w:tc>
+      </w:tr>
+      <w:tr>
+        <w:tc>
+          <w:tcPr>
+            <w:tcW w:type="dxa" w:w="8640"/>
+            <w:gridSpan w:val="2"/>
+            <w:shd w:val="clear" w:color="auto" w:fill="2E75B6"/>
+          </w:tcPr>
+          <w:p>
+            <w:r/>
+            <w:r>
+              <w:rPr>
+                <w:b/>
+                <w:color w:val="FFFFFF"/>
+                <w:sz w:val="20"/>
+              </w:rPr>
+              <w:t>CONFIGURACIÓN</w:t>
+            </w:r>
+          </w:p>
+        </w:tc>
+      </w:tr>
+      <w:tr>
+        <w:tc>
+          <w:tcPr>
+            <w:tcW w:type="dxa" w:w="4320"/>
+            <w:shd w:val="clear" w:color="auto" w:fill="D6E4F0"/>
+          </w:tcPr>
+          <w:p>
+            <w:r/>
+            <w:r>
+              <w:rPr>
+                <w:b/>
+                <w:color w:val="222222"/>
+                <w:sz w:val="20"/>
+              </w:rPr>
+              <w:t>Entorno</w:t>
+            </w:r>
+          </w:p>
+        </w:tc>
+        <w:tc>
+          <w:tcPr>
+            <w:tcW w:type="dxa" w:w="4320"/>
+          </w:tcPr>
+          <w:p>
+            <w:r/>
+            <w:r>
+              <w:rPr>
+                <w:b w:val="0"/>
+                <w:color w:val="222222"/>
+                <w:sz w:val="20"/>
+              </w:rPr>
+              <w:t>Selenium WebDriver 4 sobre Google Chrome real (ventana visible, resolución 1600×1000). La propia suite levanta el backend (uvicorn, spc.api.main:app) y el frontend (Vite) en puertos libres; el control de acceso está activo y la persistencia usa una base SQLite temporal por corrida (no toca la base real ni Supabase). Datos: los Excel del negocio de ejemplo examples/datos_excel_pyme/botica_farmasalud/.</w:t>
+            </w:r>
+          </w:p>
+        </w:tc>
+      </w:tr>
+      <w:tr>
+        <w:tc>
+          <w:tcPr>
+            <w:tcW w:type="dxa" w:w="4320"/>
+            <w:shd w:val="clear" w:color="auto" w:fill="D6E4F0"/>
+          </w:tcPr>
+          <w:p>
+            <w:r/>
+            <w:r>
+              <w:rPr>
+                <w:b/>
+                <w:color w:val="222222"/>
+                <w:sz w:val="20"/>
+              </w:rPr>
+              <w:t>Comando</w:t>
+            </w:r>
+          </w:p>
+        </w:tc>
+        <w:tc>
+          <w:tcPr>
+            <w:tcW w:type="dxa" w:w="4320"/>
+          </w:tcPr>
+          <w:p>
+            <w:r/>
+            <w:r>
+              <w:rPr>
+                <w:b w:val="0"/>
+                <w:color w:val="222222"/>
+                <w:sz w:val="20"/>
+              </w:rPr>
+              <w:t>venv/Scripts/python -m pytest tests/e2e_selenium -m selenium -v</w:t>
+            </w:r>
+          </w:p>
+        </w:tc>
+      </w:tr>
+      <w:tr>
+        <w:tc>
+          <w:tcPr>
+            <w:tcW w:type="dxa" w:w="4320"/>
+            <w:shd w:val="clear" w:color="auto" w:fill="D6E4F0"/>
+          </w:tcPr>
+          <w:p>
+            <w:r/>
+            <w:r>
+              <w:rPr>
+                <w:b/>
+                <w:color w:val="222222"/>
+                <w:sz w:val="20"/>
+              </w:rPr>
+              <w:t>Evidencia</w:t>
+            </w:r>
+          </w:p>
+        </w:tc>
+        <w:tc>
+          <w:tcPr>
+            <w:tcW w:type="dxa" w:w="4320"/>
+          </w:tcPr>
+          <w:p>
+            <w:r/>
+            <w:r>
+              <w:rPr>
+                <w:b w:val="0"/>
+                <w:color w:val="222222"/>
+                <w:sz w:val="20"/>
+              </w:rPr>
+              <w:t>final/evidencias/pruebas/e2e_selenium/ (video, capturas y logs)</w:t>
+            </w:r>
+          </w:p>
+        </w:tc>
+      </w:tr>
+    </w:tbl>
+    <w:p/>
+    <w:p>
+      <w:r>
+        <w:drawing>
+          <wp:inline xmlns:a="http://schemas.openxmlformats.org/drawingml/2006/main" xmlns:pic="http://schemas.openxmlformats.org/drawingml/2006/picture">
+            <wp:extent cx="5486400" cy="2700338"/>
+            <wp:docPr id="11" name="Picture 11"/>
+            <wp:cNvGraphicFramePr>
+              <a:graphicFrameLocks noChangeAspect="1"/>
+            </wp:cNvGraphicFramePr>
+            <a:graphic>
+              <a:graphicData uri="http://schemas.openxmlformats.org/drawingml/2006/picture">
+                <pic:pic>
+                  <pic:nvPicPr>
+                    <pic:cNvPr id="0" name="049_excel_corrupto_error_controlado_del_servidor_http_error.png"/>
+                    <pic:cNvPicPr/>
+                  </pic:nvPicPr>
+                  <pic:blipFill>
+                    <a:blip r:embed="rId18"/>
+                    <a:stretch>
+                      <a:fillRect/>
+                    </a:stretch>
+                  </pic:blipFill>
+                  <pic:spPr>
+                    <a:xfrm>
+                      <a:off x="0" y="0"/>
+                      <a:ext cx="5486400" cy="2700338"/>
+                    </a:xfrm>
+                    <a:prstGeom prst="rect"/>
+                  </pic:spPr>
+                </pic:pic>
+              </a:graphicData>
+            </a:graphic>
+          </wp:inline>
+        </w:drawing>
+      </w:r>
+    </w:p>
+    <w:p>
+      <w:r>
+        <w:rPr>
+          <w:i/>
+        </w:rPr>
+        <w:t>Figura 11. Errores de carga explicados, sin caídas (captura de la corrida).</w:t>
+      </w:r>
+    </w:p>
     <w:p/>
     <w:sectPr>
       <w:pgSz w:w="12240" w:h="15840"/>

</xml_diff>